<commit_message>
Updated documentation, beginning to work on a search system
</commit_message>
<xml_diff>
--- a/docs/Nea-Student-Raport.docx
+++ b/docs/Nea-Student-Raport.docx
@@ -683,11 +683,7 @@
         <w:tab/>
         <w:tab/>
         <w:tab/>
-        <w:t>Page 3-</w:t>
-      </w:r>
-      <w:r>
-        <w:rPr/>
-        <w:t>4</w:t>
+        <w:t>Page 3-4</w:t>
       </w:r>
     </w:p>
     <w:p>
@@ -710,19 +706,7 @@
         <w:tab/>
         <w:tab/>
         <w:tab/>
-        <w:t xml:space="preserve">Page </w:t>
-      </w:r>
-      <w:r>
-        <w:rPr/>
-        <w:t>4</w:t>
-      </w:r>
-      <w:r>
-        <w:rPr/>
-        <w:t>-1</w:t>
-      </w:r>
-      <w:r>
-        <w:rPr/>
-        <w:t>1</w:t>
+        <w:t>Page 4-11</w:t>
       </w:r>
     </w:p>
     <w:p>
@@ -743,11 +727,7 @@
         <w:tab/>
         <w:tab/>
         <w:tab/>
-        <w:t>Page 1</w:t>
-      </w:r>
-      <w:r>
-        <w:rPr/>
-        <w:t>1+</w:t>
+        <w:t>Page 11+</w:t>
       </w:r>
     </w:p>
     <w:p>
@@ -1116,67 +1096,7 @@
         <w:rPr>
           <w:rFonts w:ascii="Liberation Sans" w:hAnsi="Liberation Sans"/>
         </w:rPr>
-        <w:t xml:space="preserve">Despite regex being the most efficient and cleanest tool for pattern matching and text manipulation, there are little resources to improve </w:t>
-      </w:r>
-      <w:r>
-        <w:rPr>
-          <w:rFonts w:ascii="Liberation Sans" w:hAnsi="Liberation Sans"/>
-        </w:rPr>
-        <w:t>being able to solve regex problems</w:t>
-      </w:r>
-      <w:r>
-        <w:rPr>
-          <w:rFonts w:ascii="Liberation Sans" w:hAnsi="Liberation Sans"/>
-        </w:rPr>
-        <w:t xml:space="preserve">. Being experienced in </w:t>
-      </w:r>
-      <w:r>
-        <w:rPr>
-          <w:rFonts w:ascii="Liberation Sans" w:hAnsi="Liberation Sans"/>
-        </w:rPr>
-        <w:t xml:space="preserve">reading technical documentation and endulging in </w:t>
-      </w:r>
-      <w:r>
-        <w:rPr>
-          <w:rFonts w:ascii="Liberation Sans" w:hAnsi="Liberation Sans"/>
-        </w:rPr>
-        <w:t xml:space="preserve">programming </w:t>
-      </w:r>
-      <w:r>
-        <w:rPr>
-          <w:rFonts w:ascii="Liberation Sans" w:hAnsi="Liberation Sans"/>
-        </w:rPr>
-        <w:t>resources</w:t>
-      </w:r>
-      <w:r>
-        <w:rPr>
-          <w:rFonts w:ascii="Liberation Sans" w:hAnsi="Liberation Sans"/>
-        </w:rPr>
-        <w:t xml:space="preserve">, regular expressions are suprisingly ignored. However, the issue lies beyond learning the basic theory of regex, </w:t>
-      </w:r>
-      <w:r>
-        <w:rPr>
-          <w:rFonts w:ascii="Liberation Sans" w:hAnsi="Liberation Sans"/>
-        </w:rPr>
-        <w:t>and</w:t>
-      </w:r>
-      <w:r>
-        <w:rPr>
-          <w:rFonts w:ascii="Liberation Sans" w:hAnsi="Liberation Sans"/>
-        </w:rPr>
-        <w:t xml:space="preserve"> instead in being able to piece together a solution that arises from a</w:t>
-      </w:r>
-      <w:r>
-        <w:rPr>
-          <w:rFonts w:ascii="Liberation Sans" w:hAnsi="Liberation Sans"/>
-        </w:rPr>
-        <w:t>n array</w:t>
-      </w:r>
-      <w:r>
-        <w:rPr>
-          <w:rFonts w:ascii="Liberation Sans" w:hAnsi="Liberation Sans"/>
-        </w:rPr>
-        <w:t xml:space="preserve"> of requirements.</w:t>
+        <w:t>Despite regex being the most efficient and cleanest tool for pattern matching and text manipulation, there are little resources to improve being able to solve regex problems. Being experienced in reading technical documentation and endulging in programming resources, regular expressions are suprisingly ignored. However, the issue lies beyond learning the basic theory of regex, and instead in being able to piece together a solution that arises from an array of requirements.</w:t>
       </w:r>
     </w:p>
     <w:p>
@@ -1208,97 +1128,7 @@
         <w:rPr>
           <w:rFonts w:ascii="Liberation Sans" w:hAnsi="Liberation Sans"/>
         </w:rPr>
-        <w:t xml:space="preserve">The end user, Patrick, is passionate about software that abstracts the complexity from the user above </w:t>
-      </w:r>
-      <w:r>
-        <w:rPr>
-          <w:rFonts w:ascii="Liberation Sans" w:hAnsi="Liberation Sans"/>
-        </w:rPr>
-        <w:t xml:space="preserve">such as compilers/intepreters and parsers. </w:t>
-      </w:r>
-      <w:r>
-        <w:rPr>
-          <w:rFonts w:ascii="Liberation Sans" w:hAnsi="Liberation Sans"/>
-        </w:rPr>
-        <w:t xml:space="preserve">The problem is that once the abstract overview of these programs </w:t>
-      </w:r>
-      <w:r>
-        <w:rPr>
-          <w:rFonts w:ascii="Liberation Sans" w:hAnsi="Liberation Sans"/>
-        </w:rPr>
-        <w:t>is</w:t>
-      </w:r>
-      <w:r>
-        <w:rPr>
-          <w:rFonts w:ascii="Liberation Sans" w:hAnsi="Liberation Sans"/>
-        </w:rPr>
-        <w:t xml:space="preserve"> understood, the data processing modules </w:t>
-      </w:r>
-      <w:r>
-        <w:rPr>
-          <w:rFonts w:ascii="Liberation Sans" w:hAnsi="Liberation Sans"/>
-        </w:rPr>
-        <w:t>are</w:t>
-      </w:r>
-      <w:r>
-        <w:rPr>
-          <w:rFonts w:ascii="Liberation Sans" w:hAnsi="Liberation Sans"/>
-        </w:rPr>
-        <w:t xml:space="preserve"> </w:t>
-      </w:r>
-      <w:r>
-        <w:rPr>
-          <w:rFonts w:ascii="Liberation Sans" w:hAnsi="Liberation Sans"/>
-        </w:rPr>
-        <w:t>heavily undocumented since with regular expressions, they can be simply read from the source code rather than explained</w:t>
-      </w:r>
-      <w:r>
-        <w:rPr>
-          <w:rFonts w:ascii="Liberation Sans" w:hAnsi="Liberation Sans"/>
-        </w:rPr>
-        <w:t xml:space="preserve">. After finding this out through my own knowledge </w:t>
-      </w:r>
-      <w:r>
-        <w:rPr>
-          <w:rFonts w:ascii="Liberation Sans" w:hAnsi="Liberation Sans"/>
-        </w:rPr>
-        <w:t>and primary research</w:t>
-      </w:r>
-      <w:r>
-        <w:rPr>
-          <w:rFonts w:ascii="Liberation Sans" w:hAnsi="Liberation Sans"/>
-        </w:rPr>
-        <w:t xml:space="preserve">, and trying </w:t>
-      </w:r>
-      <w:r>
-        <w:rPr>
-          <w:rFonts w:ascii="Liberation Sans" w:hAnsi="Liberation Sans"/>
-        </w:rPr>
-        <w:t>my</w:t>
-      </w:r>
-      <w:r>
-        <w:rPr>
-          <w:rFonts w:ascii="Liberation Sans" w:hAnsi="Liberation Sans"/>
-        </w:rPr>
-        <w:t xml:space="preserve"> best to learn about the topic, it was obvious that the skill curve was too large, </w:t>
-      </w:r>
-      <w:r>
-        <w:rPr>
-          <w:rFonts w:ascii="Liberation Sans" w:hAnsi="Liberation Sans"/>
-        </w:rPr>
-        <w:t>it would lead to one of two consequences</w:t>
-      </w:r>
-      <w:r>
-        <w:rPr>
-          <w:rFonts w:ascii="Liberation Sans" w:hAnsi="Liberation Sans"/>
-        </w:rPr>
-        <w:t xml:space="preserve">. </w:t>
-      </w:r>
-      <w:r>
-        <w:rPr>
-          <w:rFonts w:ascii="Liberation Sans" w:hAnsi="Liberation Sans"/>
-        </w:rPr>
-        <w:t>A regex guide would be utilised each time you had to solve a problem with regex, or you’d have to learn it whole, also dedicating time to create the resources and data needed for practice.</w:t>
+        <w:t>The end user, Patrick, is passionate about software that abstracts the complexity from the user above such as compilers/intepreters and parsers. The problem is that once the abstract overview of these programs is understood, the data processing modules are heavily undocumented since with regular expressions, they can be simply read from the source code rather than explained. After finding this out through my own knowledge and primary research, and trying my best to learn about the topic, it was obvious that the skill curve was too large, it would lead to one of two consequences. A regex guide would be utilised each time you had to solve a problem with regex, or you’d have to learn it whole, also dedicating time to create the resources and data needed for practice.</w:t>
       </w:r>
     </w:p>
     <w:p>
@@ -1314,60 +1144,25 @@
       <w:r>
         <w:rPr>
           <w:rFonts w:ascii="Liberation Sans" w:hAnsi="Liberation Sans"/>
-        </w:rPr>
-      </w:r>
-    </w:p>
-    <w:p>
-      <w:pPr>
-        <w:pStyle w:val="BodyText"/>
-        <w:bidi w:val="0"/>
-        <w:jc w:val="left"/>
-        <w:rPr>
-          <w:rFonts w:ascii="Liberation Sans" w:hAnsi="Liberation Sans"/>
           <w:u w:val="double"/>
         </w:rPr>
-      </w:pPr>
-      <w:r>
-        <w:rPr>
-          <w:rFonts w:ascii="Liberation Sans" w:hAnsi="Liberation Sans"/>
-        </w:rPr>
-        <w:t xml:space="preserve">Therefore, on the hunt to find a project idea, </w:t>
-      </w:r>
-      <w:r>
-        <w:rPr>
-          <w:rFonts w:ascii="Liberation Sans" w:hAnsi="Liberation Sans"/>
-        </w:rPr>
-        <w:t xml:space="preserve">it was </w:t>
-      </w:r>
-      <w:r>
-        <w:rPr>
-          <w:rFonts w:ascii="Liberation Sans" w:hAnsi="Liberation Sans"/>
-        </w:rPr>
-        <w:t xml:space="preserve">settled </w:t>
-      </w:r>
-      <w:r>
-        <w:rPr>
-          <w:rFonts w:ascii="Liberation Sans" w:hAnsi="Liberation Sans"/>
-        </w:rPr>
-        <w:t xml:space="preserve">that I’d make </w:t>
-      </w:r>
-      <w:r>
-        <w:rPr>
-          <w:rFonts w:ascii="Liberation Sans" w:hAnsi="Liberation Sans"/>
-        </w:rPr>
-        <w:t xml:space="preserve">a regex practice site for </w:t>
-      </w:r>
-      <w:r>
-        <w:rPr>
-          <w:rFonts w:ascii="Liberation Sans" w:hAnsi="Liberation Sans"/>
-        </w:rPr>
-        <w:t>him</w:t>
-      </w:r>
-      <w:r>
-        <w:rPr>
-          <w:rFonts w:ascii="Liberation Sans" w:hAnsi="Liberation Sans"/>
-        </w:rPr>
-        <w:t>.</w:t>
+      </w:r>
+    </w:p>
+    <w:p>
+      <w:pPr>
+        <w:pStyle w:val="BodyText"/>
+        <w:bidi w:val="0"/>
+        <w:jc w:val="left"/>
+        <w:rPr>
+          <w:rFonts w:ascii="Liberation Sans" w:hAnsi="Liberation Sans"/>
+          <w:u w:val="double"/>
+        </w:rPr>
+      </w:pPr>
+      <w:r>
+        <w:rPr>
+          <w:rFonts w:ascii="Liberation Sans" w:hAnsi="Liberation Sans"/>
+        </w:rPr>
+        <w:t>Therefore, on the hunt to find a project idea, it was settled that I’d make a regex practice site for him.</w:t>
       </w:r>
     </w:p>
     <w:p>
@@ -1417,47 +1212,23 @@
         <w:rPr>
           <w:rFonts w:ascii="Liberation Sans" w:hAnsi="Liberation Sans"/>
         </w:rPr>
-        <w:t xml:space="preserve">For programming itself, the best resources are the most practical oriented, with written documentation and books only being used when needed </w:t>
-      </w:r>
-      <w:r>
-        <w:rPr>
-          <w:rFonts w:ascii="Liberation Sans" w:hAnsi="Liberation Sans"/>
-        </w:rPr>
-        <w:t xml:space="preserve">to learn how to implement ideas </w:t>
-      </w:r>
-      <w:r>
-        <w:rPr>
-          <w:rFonts w:ascii="Liberation Sans" w:hAnsi="Liberation Sans"/>
-        </w:rPr>
-        <w:t xml:space="preserve">(e.x. writing drivers for the linux kernel). </w:t>
-      </w:r>
-      <w:r>
-        <w:rPr>
-          <w:rFonts w:ascii="Liberation Sans" w:hAnsi="Liberation Sans"/>
-        </w:rPr>
-        <w:t xml:space="preserve">The reason for this is because the ability to make trade-offs and solve problems is more generalizable to different types of problems. </w:t>
-      </w:r>
-    </w:p>
-    <w:p>
-      <w:pPr>
-        <w:pStyle w:val="BodyText"/>
-        <w:bidi w:val="0"/>
-        <w:jc w:val="left"/>
-        <w:rPr>
-          <w:rFonts w:ascii="Liberation Sans" w:hAnsi="Liberation Sans"/>
-        </w:rPr>
-      </w:pPr>
-      <w:r>
-        <w:rPr>
-          <w:rFonts w:ascii="Liberation Sans" w:hAnsi="Liberation Sans"/>
-        </w:rPr>
-        <w:t xml:space="preserve">As a result, </w:t>
-      </w:r>
-      <w:r>
-        <w:rPr>
-          <w:rFonts w:ascii="Liberation Sans" w:hAnsi="Liberation Sans"/>
-        </w:rPr>
-        <w:t>individuals who simply read more material won’t become better engineers, and instead, the defecit in practical progress may lead to “tutorial hell”, where one is too accustomed to reading/watching tutorials and guides, leading to a halt in skill acquisition.</w:t>
+        <w:t xml:space="preserve">For programming itself, the best resources are the most practical oriented, with written documentation and books only being used when needed to learn how to implement ideas (e.x. writing drivers for the linux kernel). The reason for this is because the ability to make trade-offs and solve problems is more generalizable to different types of problems. </w:t>
+      </w:r>
+    </w:p>
+    <w:p>
+      <w:pPr>
+        <w:pStyle w:val="BodyText"/>
+        <w:bidi w:val="0"/>
+        <w:jc w:val="left"/>
+        <w:rPr>
+          <w:rFonts w:ascii="Liberation Sans" w:hAnsi="Liberation Sans"/>
+        </w:rPr>
+      </w:pPr>
+      <w:r>
+        <w:rPr>
+          <w:rFonts w:ascii="Liberation Sans" w:hAnsi="Liberation Sans"/>
+        </w:rPr>
+        <w:t>As a result, individuals who simply read more material won’t become better engineers, and instead, the defecit in practical progress may lead to “tutorial hell”, where one is too accustomed to reading/watching tutorials and guides, leading to a halt in skill acquisition.</w:t>
       </w:r>
     </w:p>
     <w:p>
@@ -1574,191 +1345,6 @@
           <w:szCs w:val="28"/>
         </w:rPr>
         <w:t>Requirements:</w:t>
-      </w:r>
-    </w:p>
-    <w:p>
-      <w:pPr>
-        <w:pStyle w:val="BodyText"/>
-        <w:bidi w:val="0"/>
-        <w:jc w:val="left"/>
-        <w:rPr>
-          <w:rFonts w:ascii="Liberation Sans" w:hAnsi="Liberation Sans"/>
-          <w:sz w:val="28"/>
-          <w:szCs w:val="28"/>
-        </w:rPr>
-      </w:pPr>
-      <w:r>
-        <w:rPr>
-          <w:rFonts w:ascii="Liberation Sans" w:hAnsi="Liberation Sans"/>
-          <w:sz w:val="28"/>
-          <w:szCs w:val="28"/>
-        </w:rPr>
-      </w:r>
-    </w:p>
-    <w:p>
-      <w:pPr>
-        <w:pStyle w:val="BodyText"/>
-        <w:bidi w:val="0"/>
-        <w:jc w:val="left"/>
-        <w:rPr>
-          <w:rFonts w:ascii="Liberation Sans" w:hAnsi="Liberation Sans"/>
-        </w:rPr>
-      </w:pPr>
-      <w:r>
-        <w:rPr>
-          <w:rFonts w:ascii="Liberation Sans" w:hAnsi="Liberation Sans"/>
-        </w:rPr>
-      </w:r>
-    </w:p>
-    <w:p>
-      <w:pPr>
-        <w:pStyle w:val="BodyText"/>
-        <w:bidi w:val="0"/>
-        <w:jc w:val="left"/>
-        <w:rPr>
-          <w:rFonts w:ascii="Liberation Sans" w:hAnsi="Liberation Sans"/>
-        </w:rPr>
-      </w:pPr>
-      <w:r>
-        <w:rPr>
-          <w:rFonts w:ascii="Liberation Sans" w:hAnsi="Liberation Sans"/>
-        </w:rPr>
-      </w:r>
-    </w:p>
-    <w:p>
-      <w:pPr>
-        <w:pStyle w:val="BodyText"/>
-        <w:bidi w:val="0"/>
-        <w:jc w:val="left"/>
-        <w:rPr>
-          <w:rFonts w:ascii="Liberation Sans" w:hAnsi="Liberation Sans"/>
-          <w:sz w:val="28"/>
-          <w:szCs w:val="28"/>
-        </w:rPr>
-      </w:pPr>
-      <w:r>
-        <w:rPr>
-          <w:rFonts w:ascii="Liberation Sans" w:hAnsi="Liberation Sans"/>
-          <w:sz w:val="28"/>
-          <w:szCs w:val="28"/>
-        </w:rPr>
-        <w:t>Objectives:</w:t>
-      </w:r>
-    </w:p>
-    <w:p>
-      <w:pPr>
-        <w:pStyle w:val="BodyText"/>
-        <w:bidi w:val="0"/>
-        <w:jc w:val="left"/>
-        <w:rPr>
-          <w:rFonts w:ascii="Liberation Sans" w:hAnsi="Liberation Sans"/>
-        </w:rPr>
-      </w:pPr>
-      <w:r>
-        <w:rPr>
-          <w:rFonts w:ascii="Liberation Sans" w:hAnsi="Liberation Sans"/>
-        </w:rPr>
-        <w:t xml:space="preserve">The problem will be solved with a website, which is a lot </w:t>
-      </w:r>
-      <w:r>
-        <w:rPr>
-          <w:rFonts w:ascii="Liberation Sans" w:hAnsi="Liberation Sans"/>
-        </w:rPr>
-        <w:t xml:space="preserve">more </w:t>
-      </w:r>
-      <w:r>
-        <w:rPr>
-          <w:rFonts w:ascii="Liberation Sans" w:hAnsi="Liberation Sans"/>
-        </w:rPr>
-        <w:t xml:space="preserve">simpler </w:t>
-      </w:r>
-      <w:r>
-        <w:rPr>
-          <w:rFonts w:ascii="Liberation Sans" w:hAnsi="Liberation Sans"/>
-        </w:rPr>
-        <w:t xml:space="preserve">on the </w:t>
-      </w:r>
-      <w:r>
-        <w:rPr>
-          <w:rFonts w:ascii="Liberation Sans" w:hAnsi="Liberation Sans"/>
-        </w:rPr>
-        <w:t>user’</w:t>
-      </w:r>
-      <w:r>
-        <w:rPr>
-          <w:rFonts w:ascii="Liberation Sans" w:hAnsi="Liberation Sans"/>
-        </w:rPr>
-        <w:t>s end</w:t>
-      </w:r>
-      <w:r>
-        <w:rPr>
-          <w:rFonts w:ascii="Liberation Sans" w:hAnsi="Liberation Sans"/>
-        </w:rPr>
-        <w:t xml:space="preserve">, and it </w:t>
-      </w:r>
-      <w:r>
-        <w:rPr>
-          <w:rFonts w:ascii="Liberation Sans" w:hAnsi="Liberation Sans"/>
-        </w:rPr>
-        <w:t xml:space="preserve">will </w:t>
-      </w:r>
-      <w:r>
-        <w:rPr>
-          <w:rFonts w:ascii="Liberation Sans" w:hAnsi="Liberation Sans"/>
-        </w:rPr>
-        <w:t xml:space="preserve">allow for more reach. </w:t>
-      </w:r>
-      <w:r>
-        <w:rPr>
-          <w:rFonts w:ascii="Liberation Sans" w:hAnsi="Liberation Sans"/>
-        </w:rPr>
-        <w:t>In theory, making a compiled program wouldn’t exactly be too troublesome, with the compilation of the project being dealt with github actions.</w:t>
-      </w:r>
-    </w:p>
-    <w:p>
-      <w:pPr>
-        <w:pStyle w:val="BodyText"/>
-        <w:bidi w:val="0"/>
-        <w:jc w:val="left"/>
-        <w:rPr>
-          <w:rFonts w:ascii="Liberation Sans" w:hAnsi="Liberation Sans"/>
-        </w:rPr>
-      </w:pPr>
-      <w:r>
-        <w:rPr>
-          <w:rFonts w:ascii="Liberation Sans" w:hAnsi="Liberation Sans"/>
-        </w:rPr>
-      </w:r>
-    </w:p>
-    <w:p>
-      <w:pPr>
-        <w:pStyle w:val="BodyText"/>
-        <w:bidi w:val="0"/>
-        <w:jc w:val="left"/>
-        <w:rPr>
-          <w:rFonts w:ascii="Liberation Sans" w:hAnsi="Liberation Sans"/>
-        </w:rPr>
-      </w:pPr>
-      <w:r>
-        <w:rPr>
-          <w:rFonts w:ascii="Liberation Sans" w:hAnsi="Liberation Sans"/>
-        </w:rPr>
-      </w:r>
-    </w:p>
-    <w:p>
-      <w:pPr>
-        <w:pStyle w:val="BodyText"/>
-        <w:bidi w:val="0"/>
-        <w:jc w:val="left"/>
-        <w:rPr>
-          <w:rFonts w:ascii="Liberation Sans" w:hAnsi="Liberation Sans"/>
-        </w:rPr>
-      </w:pPr>
-      <w:r>
-        <w:rPr>
-          <w:rFonts w:ascii="Liberation Sans" w:hAnsi="Liberation Sans"/>
-        </w:rPr>
-        <w:t>In short:</w:t>
       </w:r>
     </w:p>
     <w:p>
@@ -1782,7 +1368,15 @@
           <w:strike w:val="false"/>
           <w:dstrike w:val="false"/>
         </w:rPr>
-        <w:t>To make it easier to revise and study even when content is boring or when you find it difficult to focus,</w:t>
+        <w:t xml:space="preserve">To make it easier </w:t>
+      </w:r>
+      <w:r>
+        <w:rPr>
+          <w:rFonts w:ascii="Liberation Sans" w:hAnsi="Liberation Sans"/>
+          <w:strike w:val="false"/>
+          <w:dstrike w:val="false"/>
+        </w:rPr>
+        <w:t>practicing and learning regex compared to alternative methods,</w:t>
       </w:r>
     </w:p>
     <w:p>
@@ -1802,7 +1396,43 @@
         <w:rPr>
           <w:rFonts w:ascii="Liberation Sans" w:hAnsi="Liberation Sans"/>
         </w:rPr>
-        <w:t>To make the quiz creation system easy and quick so that you can quickly get to revising if under time constraint,</w:t>
+        <w:t xml:space="preserve">To make </w:t>
+      </w:r>
+      <w:r>
+        <w:rPr>
+          <w:rFonts w:ascii="Liberation Sans" w:hAnsi="Liberation Sans"/>
+        </w:rPr>
+        <w:t xml:space="preserve">problem </w:t>
+      </w:r>
+      <w:r>
+        <w:rPr>
+          <w:rFonts w:ascii="Liberation Sans" w:hAnsi="Liberation Sans"/>
+        </w:rPr>
+        <w:t xml:space="preserve">creation quick </w:t>
+      </w:r>
+      <w:r>
+        <w:rPr>
+          <w:rFonts w:ascii="Liberation Sans" w:hAnsi="Liberation Sans"/>
+        </w:rPr>
+        <w:t xml:space="preserve">and easy </w:t>
+      </w:r>
+      <w:r>
+        <w:rPr>
+          <w:rFonts w:ascii="Liberation Sans" w:hAnsi="Liberation Sans"/>
+        </w:rPr>
+        <w:t xml:space="preserve">so that you can quickly get to </w:t>
+      </w:r>
+      <w:r>
+        <w:rPr>
+          <w:rFonts w:ascii="Liberation Sans" w:hAnsi="Liberation Sans"/>
+        </w:rPr>
+        <w:t>solving existing problems</w:t>
+      </w:r>
+      <w:r>
+        <w:rPr>
+          <w:rFonts w:ascii="Liberation Sans" w:hAnsi="Liberation Sans"/>
+        </w:rPr>
+        <w:t>,</w:t>
       </w:r>
     </w:p>
     <w:p>
@@ -1822,7 +1452,7 @@
         <w:rPr>
           <w:rFonts w:ascii="Liberation Sans" w:hAnsi="Liberation Sans"/>
         </w:rPr>
-        <w:t>To allow flexibility in the way you learn, having dynamic quizzes, and have things easy configurable to your liking (which will help with productivity),</w:t>
+        <w:t>For the interface to be minimalistic yet useful,</w:t>
       </w:r>
     </w:p>
     <w:p>
@@ -1842,22 +1472,136 @@
         <w:rPr>
           <w:rFonts w:ascii="Liberation Sans" w:hAnsi="Liberation Sans"/>
         </w:rPr>
-        <w:t>To make it easy to collaborate with others, and to make the content on the website a pool that isn’t stagnant.</w:t>
-      </w:r>
-    </w:p>
-    <w:p>
-      <w:pPr>
-        <w:pStyle w:val="BodyText"/>
-        <w:bidi w:val="0"/>
-        <w:jc w:val="left"/>
-        <w:rPr>
-          <w:rFonts w:ascii="Liberation Sans" w:hAnsi="Liberation Sans"/>
-        </w:rPr>
-      </w:pPr>
-      <w:r>
-        <w:rPr>
-          <w:rFonts w:ascii="Liberation Sans" w:hAnsi="Liberation Sans"/>
-        </w:rPr>
+        <w:t xml:space="preserve"> </w:t>
+      </w:r>
+      <w:r>
+        <w:rPr>
+          <w:rFonts w:ascii="Liberation Sans" w:hAnsi="Liberation Sans"/>
+        </w:rPr>
+        <w:t>To motivate users to carry on using the website: daily challenges, streaks and leaderboards.</w:t>
+      </w:r>
+    </w:p>
+    <w:p>
+      <w:pPr>
+        <w:pStyle w:val="BodyText"/>
+        <w:bidi w:val="0"/>
+        <w:jc w:val="left"/>
+        <w:rPr>
+          <w:rFonts w:ascii="Liberation Sans" w:hAnsi="Liberation Sans"/>
+        </w:rPr>
+      </w:pPr>
+      <w:r>
+        <w:rPr>
+          <w:rFonts w:ascii="Liberation Sans" w:hAnsi="Liberation Sans"/>
+        </w:rPr>
+      </w:r>
+    </w:p>
+    <w:p>
+      <w:pPr>
+        <w:pStyle w:val="BodyText"/>
+        <w:bidi w:val="0"/>
+        <w:jc w:val="left"/>
+        <w:rPr>
+          <w:rFonts w:ascii="Liberation Sans" w:hAnsi="Liberation Sans"/>
+          <w:sz w:val="28"/>
+          <w:szCs w:val="28"/>
+        </w:rPr>
+      </w:pPr>
+      <w:r>
+        <w:rPr>
+          <w:rFonts w:ascii="Liberation Sans" w:hAnsi="Liberation Sans"/>
+          <w:sz w:val="28"/>
+          <w:szCs w:val="28"/>
+        </w:rPr>
+        <w:t>Objectives:</w:t>
+      </w:r>
+    </w:p>
+    <w:p>
+      <w:pPr>
+        <w:pStyle w:val="BodyText"/>
+        <w:bidi w:val="0"/>
+        <w:jc w:val="left"/>
+        <w:rPr>
+          <w:rFonts w:ascii="Liberation Sans" w:hAnsi="Liberation Sans"/>
+        </w:rPr>
+      </w:pPr>
+      <w:r>
+        <w:rPr>
+          <w:rFonts w:ascii="Liberation Sans" w:hAnsi="Liberation Sans"/>
+        </w:rPr>
+        <w:t xml:space="preserve">The problem will be solved with a website, which is a lot more simpler on the user’s end, and it will allow for more reach </w:t>
+      </w:r>
+      <w:r>
+        <w:rPr>
+          <w:rFonts w:ascii="Liberation Sans" w:hAnsi="Liberation Sans"/>
+        </w:rPr>
+        <w:t>(using the browser is the simplest it can get)</w:t>
+      </w:r>
+      <w:r>
+        <w:rPr>
+          <w:rFonts w:ascii="Liberation Sans" w:hAnsi="Liberation Sans"/>
+        </w:rPr>
+        <w:t xml:space="preserve">. In theory, making a compiled program wouldn’t be troublesome </w:t>
+      </w:r>
+      <w:r>
+        <w:rPr>
+          <w:rFonts w:ascii="Liberation Sans" w:hAnsi="Liberation Sans"/>
+        </w:rPr>
+        <w:t xml:space="preserve">since </w:t>
+      </w:r>
+      <w:r>
+        <w:rPr>
+          <w:rFonts w:ascii="Liberation Sans" w:hAnsi="Liberation Sans"/>
+        </w:rPr>
+        <w:t xml:space="preserve">the </w:t>
+      </w:r>
+      <w:r>
+        <w:rPr>
+          <w:rFonts w:ascii="Liberation Sans" w:hAnsi="Liberation Sans"/>
+        </w:rPr>
+        <w:t xml:space="preserve">packaging and hosting </w:t>
+      </w:r>
+      <w:r>
+        <w:rPr>
+          <w:rFonts w:ascii="Liberation Sans" w:hAnsi="Liberation Sans"/>
+        </w:rPr>
+        <w:t xml:space="preserve">of the </w:t>
+      </w:r>
+      <w:r>
+        <w:rPr>
+          <w:rFonts w:ascii="Liberation Sans" w:hAnsi="Liberation Sans"/>
+        </w:rPr>
+        <w:t xml:space="preserve">project could be done </w:t>
+      </w:r>
+      <w:r>
+        <w:rPr>
+          <w:rFonts w:ascii="Liberation Sans" w:hAnsi="Liberation Sans"/>
+        </w:rPr>
+        <w:t xml:space="preserve">with </w:t>
+      </w:r>
+      <w:r>
+        <w:rPr>
+          <w:rFonts w:ascii="Liberation Sans" w:hAnsi="Liberation Sans"/>
+        </w:rPr>
+        <w:t>G</w:t>
+      </w:r>
+      <w:r>
+        <w:rPr>
+          <w:rFonts w:ascii="Liberation Sans" w:hAnsi="Liberation Sans"/>
+        </w:rPr>
+        <w:t>it</w:t>
+      </w:r>
+      <w:r>
+        <w:rPr>
+          <w:rFonts w:ascii="Liberation Sans" w:hAnsi="Liberation Sans"/>
+        </w:rPr>
+        <w:t>h</w:t>
+      </w:r>
+      <w:r>
+        <w:rPr>
+          <w:rFonts w:ascii="Liberation Sans" w:hAnsi="Liberation Sans"/>
+        </w:rPr>
+        <w:t>ub.</w:t>
       </w:r>
     </w:p>
     <w:p>
@@ -2177,7 +1921,9 @@
         </w:rPr>
       </w:pPr>
       <w:r>
-        <w:rPr/>
+        <w:rPr>
+          <w:rFonts w:ascii="Liberation Sans" w:hAnsi="Liberation Sans"/>
+        </w:rPr>
       </w:r>
     </w:p>
     <w:p>
@@ -3169,27 +2915,66 @@
           <w:sz w:val="24"/>
           <w:szCs w:val="24"/>
         </w:rPr>
-        <w:t>Below is the output of command tree:</w:t>
-      </w:r>
-    </w:p>
-    <w:p>
-      <w:pPr>
-        <w:pStyle w:val="BodyText"/>
-        <w:bidi w:val="0"/>
-        <w:jc w:val="left"/>
-        <w:rPr>
-          <w:rFonts w:ascii="Liberation Sans" w:hAnsi="Liberation Sans"/>
-        </w:rPr>
-      </w:pPr>
-      <w:r>
-        <w:rPr>
-          <w:rFonts w:ascii="Liberation Sans" w:hAnsi="Liberation Sans"/>
+        <w:t xml:space="preserve">Below is the output of command tree </w:t>
+      </w:r>
+      <w:r>
+        <w:rPr>
+          <w:rFonts w:ascii="Liberation Sans" w:hAnsi="Liberation Sans"/>
+          <w:sz w:val="24"/>
+          <w:szCs w:val="24"/>
+        </w:rPr>
+        <w:t>(not including libraries – that would typically be in a “node_modules” directory – since they include thousands of files and are unindicative of my work)</w:t>
+      </w:r>
+      <w:r>
+        <w:rPr>
+          <w:rFonts w:ascii="Liberation Sans" w:hAnsi="Liberation Sans"/>
+          <w:sz w:val="24"/>
+          <w:szCs w:val="24"/>
+        </w:rPr>
+        <w:t>:</w:t>
+      </w:r>
+    </w:p>
+    <w:p>
+      <w:pPr>
+        <w:pStyle w:val="BodyText"/>
+        <w:bidi w:val="0"/>
+        <w:jc w:val="left"/>
+        <w:rPr>
+          <w:rFonts w:ascii="Liberation Sans" w:hAnsi="Liberation Sans"/>
+          <w:sz w:val="24"/>
+          <w:szCs w:val="24"/>
+        </w:rPr>
+      </w:pPr>
+      <w:r>
+        <w:rPr>
+          <w:rFonts w:ascii="Liberation Sans" w:hAnsi="Liberation Sans"/>
+          <w:sz w:val="24"/>
+          <w:szCs w:val="24"/>
+        </w:rPr>
+      </w:r>
+    </w:p>
+    <w:p>
+      <w:pPr>
+        <w:pStyle w:val="BodyText"/>
+        <w:bidi w:val="0"/>
+        <w:jc w:val="left"/>
+        <w:rPr>
+          <w:rFonts w:ascii="Liberation Sans" w:hAnsi="Liberation Sans"/>
+        </w:rPr>
+      </w:pPr>
+      <w:r>
+        <w:rPr>
+          <w:rFonts w:ascii="Liberation Sans" w:hAnsi="Liberation Sans"/>
+          <w:sz w:val="24"/>
+          <w:szCs w:val="24"/>
         </w:rPr>
         <w:t xml:space="preserve">❯ </w:t>
       </w:r>
       <w:r>
         <w:rPr>
           <w:rFonts w:ascii="Liberation Sans" w:hAnsi="Liberation Sans"/>
+          <w:sz w:val="24"/>
+          <w:szCs w:val="24"/>
         </w:rPr>
         <w:t>tree</w:t>
       </w:r>
@@ -3201,8 +2986,6 @@
         <w:jc w:val="left"/>
         <w:rPr>
           <w:rFonts w:ascii="Liberation Sans" w:hAnsi="Liberation Sans"/>
-          <w:sz w:val="24"/>
-          <w:szCs w:val="24"/>
         </w:rPr>
       </w:pPr>
       <w:r>
@@ -3221,8 +3004,7 @@
         <w:jc w:val="left"/>
         <w:rPr>
           <w:rFonts w:ascii="Liberation Sans" w:hAnsi="Liberation Sans"/>
-          <w:sz w:val="24"/>
-          <w:szCs w:val="24"/>
+          <w:u w:val="double"/>
         </w:rPr>
       </w:pPr>
       <w:r>
@@ -3239,26 +3021,16 @@
           <w:sz w:val="24"/>
           <w:szCs w:val="24"/>
         </w:rPr>
-        <w:t>LICENS</w:t>
-      </w:r>
-      <w:r>
-        <w:rPr>
-          <w:rFonts w:ascii="Liberation Sans" w:hAnsi="Liberation Sans"/>
-          <w:sz w:val="24"/>
-          <w:szCs w:val="24"/>
-        </w:rPr>
-        <w:t>E</w:t>
-      </w:r>
-    </w:p>
-    <w:p>
-      <w:pPr>
-        <w:pStyle w:val="BodyText"/>
-        <w:bidi w:val="0"/>
-        <w:jc w:val="left"/>
-        <w:rPr>
-          <w:rFonts w:ascii="Liberation Sans" w:hAnsi="Liberation Sans"/>
-          <w:sz w:val="24"/>
-          <w:szCs w:val="24"/>
+        <w:t>LICENSE</w:t>
+      </w:r>
+    </w:p>
+    <w:p>
+      <w:pPr>
+        <w:pStyle w:val="BodyText"/>
+        <w:bidi w:val="0"/>
+        <w:jc w:val="left"/>
+        <w:rPr>
+          <w:rFonts w:ascii="Liberation Sans" w:hAnsi="Liberation Sans"/>
         </w:rPr>
       </w:pPr>
       <w:r>
@@ -3285,8 +3057,6 @@
         <w:jc w:val="left"/>
         <w:rPr>
           <w:rFonts w:ascii="Liberation Sans" w:hAnsi="Liberation Sans"/>
-          <w:sz w:val="24"/>
-          <w:szCs w:val="24"/>
         </w:rPr>
       </w:pPr>
       <w:r>
@@ -3313,8 +3083,6 @@
         <w:jc w:val="left"/>
         <w:rPr>
           <w:rFonts w:ascii="Liberation Sans" w:hAnsi="Liberation Sans"/>
-          <w:sz w:val="24"/>
-          <w:szCs w:val="24"/>
         </w:rPr>
       </w:pPr>
       <w:r>
@@ -3341,8 +3109,6 @@
         <w:jc w:val="left"/>
         <w:rPr>
           <w:rFonts w:ascii="Liberation Sans" w:hAnsi="Liberation Sans"/>
-          <w:sz w:val="24"/>
-          <w:szCs w:val="24"/>
         </w:rPr>
       </w:pPr>
       <w:r>
@@ -3369,8 +3135,6 @@
         <w:jc w:val="left"/>
         <w:rPr>
           <w:rFonts w:ascii="Liberation Sans" w:hAnsi="Liberation Sans"/>
-          <w:sz w:val="24"/>
-          <w:szCs w:val="24"/>
         </w:rPr>
       </w:pPr>
       <w:r>
@@ -3397,8 +3161,6 @@
         <w:jc w:val="left"/>
         <w:rPr>
           <w:rFonts w:ascii="Liberation Sans" w:hAnsi="Liberation Sans"/>
-          <w:sz w:val="24"/>
-          <w:szCs w:val="24"/>
         </w:rPr>
       </w:pPr>
       <w:r>
@@ -3425,8 +3187,6 @@
         <w:jc w:val="left"/>
         <w:rPr>
           <w:rFonts w:ascii="Liberation Sans" w:hAnsi="Liberation Sans"/>
-          <w:sz w:val="24"/>
-          <w:szCs w:val="24"/>
         </w:rPr>
       </w:pPr>
       <w:r>
@@ -3453,8 +3213,6 @@
         <w:jc w:val="left"/>
         <w:rPr>
           <w:rFonts w:ascii="Liberation Sans" w:hAnsi="Liberation Sans"/>
-          <w:sz w:val="24"/>
-          <w:szCs w:val="24"/>
         </w:rPr>
       </w:pPr>
       <w:r>
@@ -3481,8 +3239,6 @@
         <w:jc w:val="left"/>
         <w:rPr>
           <w:rFonts w:ascii="Liberation Sans" w:hAnsi="Liberation Sans"/>
-          <w:sz w:val="24"/>
-          <w:szCs w:val="24"/>
         </w:rPr>
       </w:pPr>
       <w:r>
@@ -3509,8 +3265,6 @@
         <w:jc w:val="left"/>
         <w:rPr>
           <w:rFonts w:ascii="Liberation Sans" w:hAnsi="Liberation Sans"/>
-          <w:sz w:val="24"/>
-          <w:szCs w:val="24"/>
         </w:rPr>
       </w:pPr>
       <w:r>
@@ -3537,8 +3291,6 @@
         <w:jc w:val="left"/>
         <w:rPr>
           <w:rFonts w:ascii="Liberation Sans" w:hAnsi="Liberation Sans"/>
-          <w:sz w:val="24"/>
-          <w:szCs w:val="24"/>
         </w:rPr>
       </w:pPr>
       <w:r>
@@ -3565,8 +3317,6 @@
         <w:jc w:val="left"/>
         <w:rPr>
           <w:rFonts w:ascii="Liberation Sans" w:hAnsi="Liberation Sans"/>
-          <w:sz w:val="24"/>
-          <w:szCs w:val="24"/>
         </w:rPr>
       </w:pPr>
       <w:r>
@@ -3593,8 +3343,6 @@
         <w:jc w:val="left"/>
         <w:rPr>
           <w:rFonts w:ascii="Liberation Sans" w:hAnsi="Liberation Sans"/>
-          <w:sz w:val="24"/>
-          <w:szCs w:val="24"/>
         </w:rPr>
       </w:pPr>
       <w:r>
@@ -3621,8 +3369,6 @@
         <w:jc w:val="left"/>
         <w:rPr>
           <w:rFonts w:ascii="Liberation Sans" w:hAnsi="Liberation Sans"/>
-          <w:sz w:val="24"/>
-          <w:szCs w:val="24"/>
         </w:rPr>
       </w:pPr>
       <w:r>
@@ -3649,8 +3395,6 @@
         <w:jc w:val="left"/>
         <w:rPr>
           <w:rFonts w:ascii="Liberation Sans" w:hAnsi="Liberation Sans"/>
-          <w:sz w:val="24"/>
-          <w:szCs w:val="24"/>
         </w:rPr>
       </w:pPr>
       <w:r>
@@ -3677,8 +3421,6 @@
         <w:jc w:val="left"/>
         <w:rPr>
           <w:rFonts w:ascii="Liberation Sans" w:hAnsi="Liberation Sans"/>
-          <w:sz w:val="24"/>
-          <w:szCs w:val="24"/>
         </w:rPr>
       </w:pPr>
       <w:r>
@@ -3705,8 +3447,6 @@
         <w:jc w:val="left"/>
         <w:rPr>
           <w:rFonts w:ascii="Liberation Sans" w:hAnsi="Liberation Sans"/>
-          <w:sz w:val="24"/>
-          <w:szCs w:val="24"/>
         </w:rPr>
       </w:pPr>
       <w:r>
@@ -3733,8 +3473,6 @@
         <w:jc w:val="left"/>
         <w:rPr>
           <w:rFonts w:ascii="Liberation Sans" w:hAnsi="Liberation Sans"/>
-          <w:sz w:val="24"/>
-          <w:szCs w:val="24"/>
         </w:rPr>
       </w:pPr>
       <w:r>
@@ -3761,8 +3499,6 @@
         <w:jc w:val="left"/>
         <w:rPr>
           <w:rFonts w:ascii="Liberation Sans" w:hAnsi="Liberation Sans"/>
-          <w:sz w:val="24"/>
-          <w:szCs w:val="24"/>
         </w:rPr>
       </w:pPr>
       <w:r>
@@ -3789,8 +3525,6 @@
         <w:jc w:val="left"/>
         <w:rPr>
           <w:rFonts w:ascii="Liberation Sans" w:hAnsi="Liberation Sans"/>
-          <w:sz w:val="24"/>
-          <w:szCs w:val="24"/>
         </w:rPr>
       </w:pPr>
       <w:r>
@@ -3817,8 +3551,6 @@
         <w:jc w:val="left"/>
         <w:rPr>
           <w:rFonts w:ascii="Liberation Sans" w:hAnsi="Liberation Sans"/>
-          <w:sz w:val="24"/>
-          <w:szCs w:val="24"/>
         </w:rPr>
       </w:pPr>
       <w:r>
@@ -3845,8 +3577,6 @@
         <w:jc w:val="left"/>
         <w:rPr>
           <w:rFonts w:ascii="Liberation Sans" w:hAnsi="Liberation Sans"/>
-          <w:sz w:val="24"/>
-          <w:szCs w:val="24"/>
         </w:rPr>
       </w:pPr>
       <w:r>
@@ -3873,8 +3603,6 @@
         <w:jc w:val="left"/>
         <w:rPr>
           <w:rFonts w:ascii="Liberation Sans" w:hAnsi="Liberation Sans"/>
-          <w:sz w:val="24"/>
-          <w:szCs w:val="24"/>
         </w:rPr>
       </w:pPr>
       <w:r>
@@ -3901,8 +3629,84 @@
         <w:jc w:val="left"/>
         <w:rPr>
           <w:rFonts w:ascii="Liberation Sans" w:hAnsi="Liberation Sans"/>
-          <w:sz w:val="24"/>
-          <w:szCs w:val="24"/>
+        </w:rPr>
+      </w:pPr>
+      <w:r>
+        <w:rPr>
+          <w:rFonts w:ascii="Liberation Sans" w:hAnsi="Liberation Sans"/>
+          <w:sz w:val="24"/>
+          <w:szCs w:val="24"/>
+        </w:rPr>
+        <w:t xml:space="preserve">│   └── </w:t>
+      </w:r>
+      <w:r>
+        <w:rPr>
+          <w:rFonts w:ascii="Liberation Sans" w:hAnsi="Liberation Sans"/>
+          <w:sz w:val="24"/>
+          <w:szCs w:val="24"/>
+        </w:rPr>
+        <w:t>js</w:t>
+      </w:r>
+    </w:p>
+    <w:p>
+      <w:pPr>
+        <w:pStyle w:val="BodyText"/>
+        <w:bidi w:val="0"/>
+        <w:jc w:val="left"/>
+        <w:rPr>
+          <w:rFonts w:ascii="Liberation Sans" w:hAnsi="Liberation Sans"/>
+        </w:rPr>
+      </w:pPr>
+      <w:r>
+        <w:rPr>
+          <w:rFonts w:ascii="Liberation Sans" w:hAnsi="Liberation Sans"/>
+          <w:sz w:val="24"/>
+          <w:szCs w:val="24"/>
+        </w:rPr>
+        <w:t xml:space="preserve">├── </w:t>
+      </w:r>
+      <w:r>
+        <w:rPr>
+          <w:rFonts w:ascii="Liberation Sans" w:hAnsi="Liberation Sans"/>
+          <w:sz w:val="24"/>
+          <w:szCs w:val="24"/>
+        </w:rPr>
+        <w:t>routes</w:t>
+      </w:r>
+    </w:p>
+    <w:p>
+      <w:pPr>
+        <w:pStyle w:val="BodyText"/>
+        <w:bidi w:val="0"/>
+        <w:jc w:val="left"/>
+        <w:rPr>
+          <w:rFonts w:ascii="Liberation Sans" w:hAnsi="Liberation Sans"/>
+        </w:rPr>
+      </w:pPr>
+      <w:r>
+        <w:rPr>
+          <w:rFonts w:ascii="Liberation Sans" w:hAnsi="Liberation Sans"/>
+          <w:sz w:val="24"/>
+          <w:szCs w:val="24"/>
+        </w:rPr>
+        <w:t xml:space="preserve">├── </w:t>
+      </w:r>
+      <w:r>
+        <w:rPr>
+          <w:rFonts w:ascii="Liberation Sans" w:hAnsi="Liberation Sans"/>
+          <w:sz w:val="24"/>
+          <w:szCs w:val="24"/>
+        </w:rPr>
+        <w:t>src</w:t>
+      </w:r>
+    </w:p>
+    <w:p>
+      <w:pPr>
+        <w:pStyle w:val="BodyText"/>
+        <w:bidi w:val="0"/>
+        <w:jc w:val="left"/>
+        <w:rPr>
+          <w:rFonts w:ascii="Liberation Sans" w:hAnsi="Liberation Sans"/>
         </w:rPr>
       </w:pPr>
       <w:r>
@@ -3919,18 +3723,458 @@
           <w:sz w:val="24"/>
           <w:szCs w:val="24"/>
         </w:rPr>
-        <w:t>js</w:t>
-      </w:r>
-    </w:p>
-    <w:p>
-      <w:pPr>
-        <w:pStyle w:val="BodyText"/>
-        <w:bidi w:val="0"/>
-        <w:jc w:val="left"/>
-        <w:rPr>
-          <w:rFonts w:ascii="Liberation Sans" w:hAnsi="Liberation Sans"/>
-          <w:sz w:val="24"/>
-          <w:szCs w:val="24"/>
+        <w:t>public</w:t>
+      </w:r>
+    </w:p>
+    <w:p>
+      <w:pPr>
+        <w:pStyle w:val="BodyText"/>
+        <w:bidi w:val="0"/>
+        <w:jc w:val="left"/>
+        <w:rPr>
+          <w:rFonts w:ascii="Liberation Sans" w:hAnsi="Liberation Sans"/>
+        </w:rPr>
+      </w:pPr>
+      <w:r>
+        <w:rPr>
+          <w:rFonts w:ascii="Liberation Sans" w:hAnsi="Liberation Sans"/>
+          <w:sz w:val="24"/>
+          <w:szCs w:val="24"/>
+        </w:rPr>
+        <w:t xml:space="preserve">│   │   ├── </w:t>
+      </w:r>
+      <w:r>
+        <w:rPr>
+          <w:rFonts w:ascii="Liberation Sans" w:hAnsi="Liberation Sans"/>
+          <w:sz w:val="24"/>
+          <w:szCs w:val="24"/>
+        </w:rPr>
+        <w:t>create.ts</w:t>
+      </w:r>
+    </w:p>
+    <w:p>
+      <w:pPr>
+        <w:pStyle w:val="BodyText"/>
+        <w:bidi w:val="0"/>
+        <w:jc w:val="left"/>
+        <w:rPr>
+          <w:rFonts w:ascii="Liberation Sans" w:hAnsi="Liberation Sans"/>
+        </w:rPr>
+      </w:pPr>
+      <w:r>
+        <w:rPr>
+          <w:rFonts w:ascii="Liberation Sans" w:hAnsi="Liberation Sans"/>
+          <w:sz w:val="24"/>
+          <w:szCs w:val="24"/>
+        </w:rPr>
+        <w:t xml:space="preserve">│   │   ├── </w:t>
+      </w:r>
+      <w:r>
+        <w:rPr>
+          <w:rFonts w:ascii="Liberation Sans" w:hAnsi="Liberation Sans"/>
+          <w:sz w:val="24"/>
+          <w:szCs w:val="24"/>
+        </w:rPr>
+        <w:t>login.ts</w:t>
+      </w:r>
+    </w:p>
+    <w:p>
+      <w:pPr>
+        <w:pStyle w:val="BodyText"/>
+        <w:bidi w:val="0"/>
+        <w:jc w:val="left"/>
+        <w:rPr>
+          <w:rFonts w:ascii="Liberation Sans" w:hAnsi="Liberation Sans"/>
+        </w:rPr>
+      </w:pPr>
+      <w:r>
+        <w:rPr>
+          <w:rFonts w:ascii="Liberation Sans" w:hAnsi="Liberation Sans"/>
+          <w:sz w:val="24"/>
+          <w:szCs w:val="24"/>
+        </w:rPr>
+        <w:t xml:space="preserve">│   │   ├── </w:t>
+      </w:r>
+      <w:r>
+        <w:rPr>
+          <w:rFonts w:ascii="Liberation Sans" w:hAnsi="Liberation Sans"/>
+          <w:sz w:val="24"/>
+          <w:szCs w:val="24"/>
+        </w:rPr>
+        <w:t>search.ts</w:t>
+      </w:r>
+    </w:p>
+    <w:p>
+      <w:pPr>
+        <w:pStyle w:val="BodyText"/>
+        <w:bidi w:val="0"/>
+        <w:jc w:val="left"/>
+        <w:rPr>
+          <w:rFonts w:ascii="Liberation Sans" w:hAnsi="Liberation Sans"/>
+        </w:rPr>
+      </w:pPr>
+      <w:r>
+        <w:rPr>
+          <w:rFonts w:ascii="Liberation Sans" w:hAnsi="Liberation Sans"/>
+          <w:sz w:val="24"/>
+          <w:szCs w:val="24"/>
+        </w:rPr>
+        <w:t xml:space="preserve">│   │   ├── </w:t>
+      </w:r>
+      <w:r>
+        <w:rPr>
+          <w:rFonts w:ascii="Liberation Sans" w:hAnsi="Liberation Sans"/>
+          <w:sz w:val="24"/>
+          <w:szCs w:val="24"/>
+        </w:rPr>
+        <w:t>signup.ts</w:t>
+      </w:r>
+    </w:p>
+    <w:p>
+      <w:pPr>
+        <w:pStyle w:val="BodyText"/>
+        <w:bidi w:val="0"/>
+        <w:jc w:val="left"/>
+        <w:rPr>
+          <w:rFonts w:ascii="Liberation Sans" w:hAnsi="Liberation Sans"/>
+        </w:rPr>
+      </w:pPr>
+      <w:r>
+        <w:rPr>
+          <w:rFonts w:ascii="Liberation Sans" w:hAnsi="Liberation Sans"/>
+          <w:sz w:val="24"/>
+          <w:szCs w:val="24"/>
+        </w:rPr>
+        <w:t xml:space="preserve">│   │   └── </w:t>
+      </w:r>
+      <w:r>
+        <w:rPr>
+          <w:rFonts w:ascii="Liberation Sans" w:hAnsi="Liberation Sans"/>
+          <w:sz w:val="24"/>
+          <w:szCs w:val="24"/>
+        </w:rPr>
+        <w:t>solve.ts</w:t>
+      </w:r>
+    </w:p>
+    <w:p>
+      <w:pPr>
+        <w:pStyle w:val="BodyText"/>
+        <w:bidi w:val="0"/>
+        <w:jc w:val="left"/>
+        <w:rPr>
+          <w:rFonts w:ascii="Liberation Sans" w:hAnsi="Liberation Sans"/>
+        </w:rPr>
+      </w:pPr>
+      <w:r>
+        <w:rPr>
+          <w:rFonts w:ascii="Liberation Sans" w:hAnsi="Liberation Sans"/>
+          <w:sz w:val="24"/>
+          <w:szCs w:val="24"/>
+        </w:rPr>
+        <w:t xml:space="preserve">│   ├── </w:t>
+      </w:r>
+      <w:r>
+        <w:rPr>
+          <w:rFonts w:ascii="Liberation Sans" w:hAnsi="Liberation Sans"/>
+          <w:sz w:val="24"/>
+          <w:szCs w:val="24"/>
+        </w:rPr>
+        <w:t>routes</w:t>
+      </w:r>
+    </w:p>
+    <w:p>
+      <w:pPr>
+        <w:pStyle w:val="BodyText"/>
+        <w:bidi w:val="0"/>
+        <w:jc w:val="left"/>
+        <w:rPr>
+          <w:rFonts w:ascii="Liberation Sans" w:hAnsi="Liberation Sans"/>
+        </w:rPr>
+      </w:pPr>
+      <w:r>
+        <w:rPr>
+          <w:rFonts w:ascii="Liberation Sans" w:hAnsi="Liberation Sans"/>
+          <w:sz w:val="24"/>
+          <w:szCs w:val="24"/>
+        </w:rPr>
+        <w:t xml:space="preserve">│   │   ├── </w:t>
+      </w:r>
+      <w:r>
+        <w:rPr>
+          <w:rFonts w:ascii="Liberation Sans" w:hAnsi="Liberation Sans"/>
+          <w:sz w:val="24"/>
+          <w:szCs w:val="24"/>
+        </w:rPr>
+        <w:t>browse.ts</w:t>
+      </w:r>
+    </w:p>
+    <w:p>
+      <w:pPr>
+        <w:pStyle w:val="BodyText"/>
+        <w:bidi w:val="0"/>
+        <w:jc w:val="left"/>
+        <w:rPr>
+          <w:rFonts w:ascii="Liberation Sans" w:hAnsi="Liberation Sans"/>
+        </w:rPr>
+      </w:pPr>
+      <w:r>
+        <w:rPr>
+          <w:rFonts w:ascii="Liberation Sans" w:hAnsi="Liberation Sans"/>
+          <w:sz w:val="24"/>
+          <w:szCs w:val="24"/>
+        </w:rPr>
+        <w:t xml:space="preserve">│   │   ├── </w:t>
+      </w:r>
+      <w:r>
+        <w:rPr>
+          <w:rFonts w:ascii="Liberation Sans" w:hAnsi="Liberation Sans"/>
+          <w:sz w:val="24"/>
+          <w:szCs w:val="24"/>
+        </w:rPr>
+        <w:t>create-problem.ts</w:t>
+      </w:r>
+    </w:p>
+    <w:p>
+      <w:pPr>
+        <w:pStyle w:val="BodyText"/>
+        <w:bidi w:val="0"/>
+        <w:jc w:val="left"/>
+        <w:rPr>
+          <w:rFonts w:ascii="Liberation Sans" w:hAnsi="Liberation Sans"/>
+        </w:rPr>
+      </w:pPr>
+      <w:r>
+        <w:rPr>
+          <w:rFonts w:ascii="Liberation Sans" w:hAnsi="Liberation Sans"/>
+          <w:sz w:val="24"/>
+          <w:szCs w:val="24"/>
+        </w:rPr>
+        <w:t xml:space="preserve">│   │   ├── </w:t>
+      </w:r>
+      <w:r>
+        <w:rPr>
+          <w:rFonts w:ascii="Liberation Sans" w:hAnsi="Liberation Sans"/>
+          <w:sz w:val="24"/>
+          <w:szCs w:val="24"/>
+        </w:rPr>
+        <w:t>get-problem.ts</w:t>
+      </w:r>
+    </w:p>
+    <w:p>
+      <w:pPr>
+        <w:pStyle w:val="BodyText"/>
+        <w:bidi w:val="0"/>
+        <w:jc w:val="left"/>
+        <w:rPr>
+          <w:rFonts w:ascii="Liberation Sans" w:hAnsi="Liberation Sans"/>
+        </w:rPr>
+      </w:pPr>
+      <w:r>
+        <w:rPr>
+          <w:rFonts w:ascii="Liberation Sans" w:hAnsi="Liberation Sans"/>
+          <w:sz w:val="24"/>
+          <w:szCs w:val="24"/>
+        </w:rPr>
+        <w:t xml:space="preserve">│   │   ├── </w:t>
+      </w:r>
+      <w:r>
+        <w:rPr>
+          <w:rFonts w:ascii="Liberation Sans" w:hAnsi="Liberation Sans"/>
+          <w:sz w:val="24"/>
+          <w:szCs w:val="24"/>
+        </w:rPr>
+        <w:t>get-session.ts</w:t>
+      </w:r>
+    </w:p>
+    <w:p>
+      <w:pPr>
+        <w:pStyle w:val="BodyText"/>
+        <w:bidi w:val="0"/>
+        <w:jc w:val="left"/>
+        <w:rPr>
+          <w:rFonts w:ascii="Liberation Sans" w:hAnsi="Liberation Sans"/>
+        </w:rPr>
+      </w:pPr>
+      <w:r>
+        <w:rPr>
+          <w:rFonts w:ascii="Liberation Sans" w:hAnsi="Liberation Sans"/>
+          <w:sz w:val="24"/>
+          <w:szCs w:val="24"/>
+        </w:rPr>
+        <w:t xml:space="preserve">│   │   ├── </w:t>
+      </w:r>
+      <w:r>
+        <w:rPr>
+          <w:rFonts w:ascii="Liberation Sans" w:hAnsi="Liberation Sans"/>
+          <w:sz w:val="24"/>
+          <w:szCs w:val="24"/>
+        </w:rPr>
+        <w:t>index.ts</w:t>
+      </w:r>
+    </w:p>
+    <w:p>
+      <w:pPr>
+        <w:pStyle w:val="BodyText"/>
+        <w:bidi w:val="0"/>
+        <w:jc w:val="left"/>
+        <w:rPr>
+          <w:rFonts w:ascii="Liberation Sans" w:hAnsi="Liberation Sans"/>
+        </w:rPr>
+      </w:pPr>
+      <w:r>
+        <w:rPr>
+          <w:rFonts w:ascii="Liberation Sans" w:hAnsi="Liberation Sans"/>
+          <w:sz w:val="24"/>
+          <w:szCs w:val="24"/>
+        </w:rPr>
+        <w:t xml:space="preserve">│   │   ├── </w:t>
+      </w:r>
+      <w:r>
+        <w:rPr>
+          <w:rFonts w:ascii="Liberation Sans" w:hAnsi="Liberation Sans"/>
+          <w:sz w:val="24"/>
+          <w:szCs w:val="24"/>
+        </w:rPr>
+        <w:t>problem.ts</w:t>
+      </w:r>
+    </w:p>
+    <w:p>
+      <w:pPr>
+        <w:pStyle w:val="BodyText"/>
+        <w:bidi w:val="0"/>
+        <w:jc w:val="left"/>
+        <w:rPr>
+          <w:rFonts w:ascii="Liberation Sans" w:hAnsi="Liberation Sans"/>
+        </w:rPr>
+      </w:pPr>
+      <w:r>
+        <w:rPr>
+          <w:rFonts w:ascii="Liberation Sans" w:hAnsi="Liberation Sans"/>
+          <w:sz w:val="24"/>
+          <w:szCs w:val="24"/>
+        </w:rPr>
+        <w:t xml:space="preserve">│   │   ├── </w:t>
+      </w:r>
+      <w:r>
+        <w:rPr>
+          <w:rFonts w:ascii="Liberation Sans" w:hAnsi="Liberation Sans"/>
+          <w:sz w:val="24"/>
+          <w:szCs w:val="24"/>
+        </w:rPr>
+        <w:t>search-request.ts</w:t>
+      </w:r>
+    </w:p>
+    <w:p>
+      <w:pPr>
+        <w:pStyle w:val="BodyText"/>
+        <w:bidi w:val="0"/>
+        <w:jc w:val="left"/>
+        <w:rPr>
+          <w:rFonts w:ascii="Liberation Sans" w:hAnsi="Liberation Sans"/>
+        </w:rPr>
+      </w:pPr>
+      <w:r>
+        <w:rPr>
+          <w:rFonts w:ascii="Liberation Sans" w:hAnsi="Liberation Sans"/>
+          <w:sz w:val="24"/>
+          <w:szCs w:val="24"/>
+        </w:rPr>
+        <w:t xml:space="preserve">│   │   ├── </w:t>
+      </w:r>
+      <w:r>
+        <w:rPr>
+          <w:rFonts w:ascii="Liberation Sans" w:hAnsi="Liberation Sans"/>
+          <w:sz w:val="24"/>
+          <w:szCs w:val="24"/>
+        </w:rPr>
+        <w:t>submit-attempt.ts</w:t>
+      </w:r>
+    </w:p>
+    <w:p>
+      <w:pPr>
+        <w:pStyle w:val="BodyText"/>
+        <w:bidi w:val="0"/>
+        <w:jc w:val="left"/>
+        <w:rPr>
+          <w:rFonts w:ascii="Liberation Sans" w:hAnsi="Liberation Sans"/>
+        </w:rPr>
+      </w:pPr>
+      <w:r>
+        <w:rPr>
+          <w:rFonts w:ascii="Liberation Sans" w:hAnsi="Liberation Sans"/>
+          <w:sz w:val="24"/>
+          <w:szCs w:val="24"/>
+        </w:rPr>
+        <w:t xml:space="preserve">│   │   ├── </w:t>
+      </w:r>
+      <w:r>
+        <w:rPr>
+          <w:rFonts w:ascii="Liberation Sans" w:hAnsi="Liberation Sans"/>
+          <w:sz w:val="24"/>
+          <w:szCs w:val="24"/>
+        </w:rPr>
+        <w:t>submit-login.ts</w:t>
+      </w:r>
+    </w:p>
+    <w:p>
+      <w:pPr>
+        <w:pStyle w:val="BodyText"/>
+        <w:bidi w:val="0"/>
+        <w:jc w:val="left"/>
+        <w:rPr>
+          <w:rFonts w:ascii="Liberation Sans" w:hAnsi="Liberation Sans"/>
+        </w:rPr>
+      </w:pPr>
+      <w:r>
+        <w:rPr>
+          <w:rFonts w:ascii="Liberation Sans" w:hAnsi="Liberation Sans"/>
+          <w:sz w:val="24"/>
+          <w:szCs w:val="24"/>
+        </w:rPr>
+        <w:t xml:space="preserve">│   │   ├── </w:t>
+      </w:r>
+      <w:r>
+        <w:rPr>
+          <w:rFonts w:ascii="Liberation Sans" w:hAnsi="Liberation Sans"/>
+          <w:sz w:val="24"/>
+          <w:szCs w:val="24"/>
+        </w:rPr>
+        <w:t>submit-signup.ts</w:t>
+      </w:r>
+    </w:p>
+    <w:p>
+      <w:pPr>
+        <w:pStyle w:val="BodyText"/>
+        <w:bidi w:val="0"/>
+        <w:jc w:val="left"/>
+        <w:rPr>
+          <w:rFonts w:ascii="Liberation Sans" w:hAnsi="Liberation Sans"/>
+        </w:rPr>
+      </w:pPr>
+      <w:r>
+        <w:rPr>
+          <w:rFonts w:ascii="Liberation Sans" w:hAnsi="Liberation Sans"/>
+          <w:sz w:val="24"/>
+          <w:szCs w:val="24"/>
+        </w:rPr>
+        <w:t xml:space="preserve">│   │   └── </w:t>
+      </w:r>
+      <w:r>
+        <w:rPr>
+          <w:rFonts w:ascii="Liberation Sans" w:hAnsi="Liberation Sans"/>
+          <w:sz w:val="24"/>
+          <w:szCs w:val="24"/>
+        </w:rPr>
+        <w:t>user.ts</w:t>
+      </w:r>
+    </w:p>
+    <w:p>
+      <w:pPr>
+        <w:pStyle w:val="BodyText"/>
+        <w:bidi w:val="0"/>
+        <w:jc w:val="left"/>
+        <w:rPr>
+          <w:rFonts w:ascii="Liberation Sans" w:hAnsi="Liberation Sans"/>
         </w:rPr>
       </w:pPr>
       <w:r>
@@ -3947,74 +4191,16 @@
           <w:sz w:val="24"/>
           <w:szCs w:val="24"/>
         </w:rPr>
-        <w:t>particles</w:t>
-      </w:r>
-    </w:p>
-    <w:p>
-      <w:pPr>
-        <w:pStyle w:val="BodyText"/>
-        <w:bidi w:val="0"/>
-        <w:jc w:val="left"/>
-        <w:rPr>
-          <w:rFonts w:ascii="Liberation Sans" w:hAnsi="Liberation Sans"/>
-          <w:sz w:val="24"/>
-          <w:szCs w:val="24"/>
-        </w:rPr>
-      </w:pPr>
-      <w:r>
-        <w:rPr>
-          <w:rFonts w:ascii="Liberation Sans" w:hAnsi="Liberation Sans"/>
-          <w:sz w:val="24"/>
-          <w:szCs w:val="24"/>
-        </w:rPr>
-        <w:t xml:space="preserve">│       ├── </w:t>
-      </w:r>
-      <w:r>
-        <w:rPr>
-          <w:rFonts w:ascii="Liberation Sans" w:hAnsi="Liberation Sans"/>
-          <w:sz w:val="24"/>
-          <w:szCs w:val="24"/>
-        </w:rPr>
-        <w:t>particles.json</w:t>
-      </w:r>
-    </w:p>
-    <w:p>
-      <w:pPr>
-        <w:pStyle w:val="BodyText"/>
-        <w:bidi w:val="0"/>
-        <w:jc w:val="left"/>
-        <w:rPr>
-          <w:rFonts w:ascii="Liberation Sans" w:hAnsi="Liberation Sans"/>
-          <w:sz w:val="24"/>
-          <w:szCs w:val="24"/>
-        </w:rPr>
-      </w:pPr>
-      <w:r>
-        <w:rPr>
-          <w:rFonts w:ascii="Liberation Sans" w:hAnsi="Liberation Sans"/>
-          <w:sz w:val="24"/>
-          <w:szCs w:val="24"/>
-        </w:rPr>
-        <w:t xml:space="preserve">│       └── </w:t>
-      </w:r>
-      <w:r>
-        <w:rPr>
-          <w:rFonts w:ascii="Liberation Sans" w:hAnsi="Liberation Sans"/>
-          <w:sz w:val="24"/>
-          <w:szCs w:val="24"/>
-        </w:rPr>
-        <w:t>particles_app.ts</w:t>
-      </w:r>
-    </w:p>
-    <w:p>
-      <w:pPr>
-        <w:pStyle w:val="BodyText"/>
-        <w:bidi w:val="0"/>
-        <w:jc w:val="left"/>
-        <w:rPr>
-          <w:rFonts w:ascii="Liberation Sans" w:hAnsi="Liberation Sans"/>
-          <w:sz w:val="24"/>
-          <w:szCs w:val="24"/>
+        <w:t>server.ts</w:t>
+      </w:r>
+    </w:p>
+    <w:p>
+      <w:pPr>
+        <w:pStyle w:val="BodyText"/>
+        <w:bidi w:val="0"/>
+        <w:jc w:val="left"/>
+        <w:rPr>
+          <w:rFonts w:ascii="Liberation Sans" w:hAnsi="Liberation Sans"/>
         </w:rPr>
       </w:pPr>
       <w:r>
@@ -4031,18 +4217,16 @@
           <w:sz w:val="24"/>
           <w:szCs w:val="24"/>
         </w:rPr>
-        <w:t>routes</w:t>
-      </w:r>
-    </w:p>
-    <w:p>
-      <w:pPr>
-        <w:pStyle w:val="BodyText"/>
-        <w:bidi w:val="0"/>
-        <w:jc w:val="left"/>
-        <w:rPr>
-          <w:rFonts w:ascii="Liberation Sans" w:hAnsi="Liberation Sans"/>
-          <w:sz w:val="24"/>
-          <w:szCs w:val="24"/>
+        <w:t>tsconfig.json</w:t>
+      </w:r>
+    </w:p>
+    <w:p>
+      <w:pPr>
+        <w:pStyle w:val="BodyText"/>
+        <w:bidi w:val="0"/>
+        <w:jc w:val="left"/>
+        <w:rPr>
+          <w:rFonts w:ascii="Liberation Sans" w:hAnsi="Liberation Sans"/>
         </w:rPr>
       </w:pPr>
       <w:r>
@@ -4059,622 +4243,6 @@
           <w:sz w:val="24"/>
           <w:szCs w:val="24"/>
         </w:rPr>
-        <w:t>src</w:t>
-      </w:r>
-    </w:p>
-    <w:p>
-      <w:pPr>
-        <w:pStyle w:val="BodyText"/>
-        <w:bidi w:val="0"/>
-        <w:jc w:val="left"/>
-        <w:rPr>
-          <w:rFonts w:ascii="Liberation Sans" w:hAnsi="Liberation Sans"/>
-          <w:sz w:val="24"/>
-          <w:szCs w:val="24"/>
-        </w:rPr>
-      </w:pPr>
-      <w:r>
-        <w:rPr>
-          <w:rFonts w:ascii="Liberation Sans" w:hAnsi="Liberation Sans"/>
-          <w:sz w:val="24"/>
-          <w:szCs w:val="24"/>
-        </w:rPr>
-        <w:t xml:space="preserve">│   ├── </w:t>
-      </w:r>
-      <w:r>
-        <w:rPr>
-          <w:rFonts w:ascii="Liberation Sans" w:hAnsi="Liberation Sans"/>
-          <w:sz w:val="24"/>
-          <w:szCs w:val="24"/>
-        </w:rPr>
-        <w:t>public</w:t>
-      </w:r>
-    </w:p>
-    <w:p>
-      <w:pPr>
-        <w:pStyle w:val="BodyText"/>
-        <w:bidi w:val="0"/>
-        <w:jc w:val="left"/>
-        <w:rPr>
-          <w:rFonts w:ascii="Liberation Sans" w:hAnsi="Liberation Sans"/>
-          <w:sz w:val="24"/>
-          <w:szCs w:val="24"/>
-        </w:rPr>
-      </w:pPr>
-      <w:r>
-        <w:rPr>
-          <w:rFonts w:ascii="Liberation Sans" w:hAnsi="Liberation Sans"/>
-          <w:sz w:val="24"/>
-          <w:szCs w:val="24"/>
-        </w:rPr>
-        <w:t xml:space="preserve">│   │   ├── </w:t>
-      </w:r>
-      <w:r>
-        <w:rPr>
-          <w:rFonts w:ascii="Liberation Sans" w:hAnsi="Liberation Sans"/>
-          <w:sz w:val="24"/>
-          <w:szCs w:val="24"/>
-        </w:rPr>
-        <w:t>create.ts</w:t>
-      </w:r>
-    </w:p>
-    <w:p>
-      <w:pPr>
-        <w:pStyle w:val="BodyText"/>
-        <w:bidi w:val="0"/>
-        <w:jc w:val="left"/>
-        <w:rPr>
-          <w:rFonts w:ascii="Liberation Sans" w:hAnsi="Liberation Sans"/>
-          <w:sz w:val="24"/>
-          <w:szCs w:val="24"/>
-        </w:rPr>
-      </w:pPr>
-      <w:r>
-        <w:rPr>
-          <w:rFonts w:ascii="Liberation Sans" w:hAnsi="Liberation Sans"/>
-          <w:sz w:val="24"/>
-          <w:szCs w:val="24"/>
-        </w:rPr>
-        <w:t xml:space="preserve">│   │   ├── </w:t>
-      </w:r>
-      <w:r>
-        <w:rPr>
-          <w:rFonts w:ascii="Liberation Sans" w:hAnsi="Liberation Sans"/>
-          <w:sz w:val="24"/>
-          <w:szCs w:val="24"/>
-        </w:rPr>
-        <w:t>login.ts</w:t>
-      </w:r>
-    </w:p>
-    <w:p>
-      <w:pPr>
-        <w:pStyle w:val="BodyText"/>
-        <w:bidi w:val="0"/>
-        <w:jc w:val="left"/>
-        <w:rPr>
-          <w:rFonts w:ascii="Liberation Sans" w:hAnsi="Liberation Sans"/>
-          <w:sz w:val="24"/>
-          <w:szCs w:val="24"/>
-        </w:rPr>
-      </w:pPr>
-      <w:r>
-        <w:rPr>
-          <w:rFonts w:ascii="Liberation Sans" w:hAnsi="Liberation Sans"/>
-          <w:sz w:val="24"/>
-          <w:szCs w:val="24"/>
-        </w:rPr>
-        <w:t xml:space="preserve">│   │   ├── </w:t>
-      </w:r>
-      <w:r>
-        <w:rPr>
-          <w:rFonts w:ascii="Liberation Sans" w:hAnsi="Liberation Sans"/>
-          <w:sz w:val="24"/>
-          <w:szCs w:val="24"/>
-        </w:rPr>
-        <w:t>search.ts</w:t>
-      </w:r>
-    </w:p>
-    <w:p>
-      <w:pPr>
-        <w:pStyle w:val="BodyText"/>
-        <w:bidi w:val="0"/>
-        <w:jc w:val="left"/>
-        <w:rPr>
-          <w:rFonts w:ascii="Liberation Sans" w:hAnsi="Liberation Sans"/>
-          <w:sz w:val="24"/>
-          <w:szCs w:val="24"/>
-        </w:rPr>
-      </w:pPr>
-      <w:r>
-        <w:rPr>
-          <w:rFonts w:ascii="Liberation Sans" w:hAnsi="Liberation Sans"/>
-          <w:sz w:val="24"/>
-          <w:szCs w:val="24"/>
-        </w:rPr>
-        <w:t xml:space="preserve">│   │   ├── </w:t>
-      </w:r>
-      <w:r>
-        <w:rPr>
-          <w:rFonts w:ascii="Liberation Sans" w:hAnsi="Liberation Sans"/>
-          <w:sz w:val="24"/>
-          <w:szCs w:val="24"/>
-        </w:rPr>
-        <w:t>signup.ts</w:t>
-      </w:r>
-    </w:p>
-    <w:p>
-      <w:pPr>
-        <w:pStyle w:val="BodyText"/>
-        <w:bidi w:val="0"/>
-        <w:jc w:val="left"/>
-        <w:rPr>
-          <w:rFonts w:ascii="Liberation Sans" w:hAnsi="Liberation Sans"/>
-          <w:sz w:val="24"/>
-          <w:szCs w:val="24"/>
-        </w:rPr>
-      </w:pPr>
-      <w:r>
-        <w:rPr>
-          <w:rFonts w:ascii="Liberation Sans" w:hAnsi="Liberation Sans"/>
-          <w:sz w:val="24"/>
-          <w:szCs w:val="24"/>
-        </w:rPr>
-        <w:t xml:space="preserve">│   │   └── </w:t>
-      </w:r>
-      <w:r>
-        <w:rPr>
-          <w:rFonts w:ascii="Liberation Sans" w:hAnsi="Liberation Sans"/>
-          <w:sz w:val="24"/>
-          <w:szCs w:val="24"/>
-        </w:rPr>
-        <w:t>solve.ts</w:t>
-      </w:r>
-    </w:p>
-    <w:p>
-      <w:pPr>
-        <w:pStyle w:val="BodyText"/>
-        <w:bidi w:val="0"/>
-        <w:jc w:val="left"/>
-        <w:rPr>
-          <w:rFonts w:ascii="Liberation Sans" w:hAnsi="Liberation Sans"/>
-          <w:sz w:val="24"/>
-          <w:szCs w:val="24"/>
-        </w:rPr>
-      </w:pPr>
-      <w:r>
-        <w:rPr>
-          <w:rFonts w:ascii="Liberation Sans" w:hAnsi="Liberation Sans"/>
-          <w:sz w:val="24"/>
-          <w:szCs w:val="24"/>
-        </w:rPr>
-        <w:t xml:space="preserve">│   ├── </w:t>
-      </w:r>
-      <w:r>
-        <w:rPr>
-          <w:rFonts w:ascii="Liberation Sans" w:hAnsi="Liberation Sans"/>
-          <w:sz w:val="24"/>
-          <w:szCs w:val="24"/>
-        </w:rPr>
-        <w:t>routes</w:t>
-      </w:r>
-    </w:p>
-    <w:p>
-      <w:pPr>
-        <w:pStyle w:val="BodyText"/>
-        <w:bidi w:val="0"/>
-        <w:jc w:val="left"/>
-        <w:rPr>
-          <w:rFonts w:ascii="Liberation Sans" w:hAnsi="Liberation Sans"/>
-          <w:sz w:val="24"/>
-          <w:szCs w:val="24"/>
-        </w:rPr>
-      </w:pPr>
-      <w:r>
-        <w:rPr>
-          <w:rFonts w:ascii="Liberation Sans" w:hAnsi="Liberation Sans"/>
-          <w:sz w:val="24"/>
-          <w:szCs w:val="24"/>
-        </w:rPr>
-        <w:t xml:space="preserve">│   │   ├── </w:t>
-      </w:r>
-      <w:r>
-        <w:rPr>
-          <w:rFonts w:ascii="Liberation Sans" w:hAnsi="Liberation Sans"/>
-          <w:sz w:val="24"/>
-          <w:szCs w:val="24"/>
-        </w:rPr>
-        <w:t>browse.ts</w:t>
-      </w:r>
-    </w:p>
-    <w:p>
-      <w:pPr>
-        <w:pStyle w:val="BodyText"/>
-        <w:bidi w:val="0"/>
-        <w:jc w:val="left"/>
-        <w:rPr>
-          <w:rFonts w:ascii="Liberation Sans" w:hAnsi="Liberation Sans"/>
-          <w:sz w:val="24"/>
-          <w:szCs w:val="24"/>
-        </w:rPr>
-      </w:pPr>
-      <w:r>
-        <w:rPr>
-          <w:rFonts w:ascii="Liberation Sans" w:hAnsi="Liberation Sans"/>
-          <w:sz w:val="24"/>
-          <w:szCs w:val="24"/>
-        </w:rPr>
-        <w:t xml:space="preserve">│   │   ├── </w:t>
-      </w:r>
-      <w:r>
-        <w:rPr>
-          <w:rFonts w:ascii="Liberation Sans" w:hAnsi="Liberation Sans"/>
-          <w:sz w:val="24"/>
-          <w:szCs w:val="24"/>
-        </w:rPr>
-        <w:t>create-problem.ts</w:t>
-      </w:r>
-    </w:p>
-    <w:p>
-      <w:pPr>
-        <w:pStyle w:val="BodyText"/>
-        <w:bidi w:val="0"/>
-        <w:jc w:val="left"/>
-        <w:rPr>
-          <w:rFonts w:ascii="Liberation Sans" w:hAnsi="Liberation Sans"/>
-          <w:sz w:val="24"/>
-          <w:szCs w:val="24"/>
-        </w:rPr>
-      </w:pPr>
-      <w:r>
-        <w:rPr>
-          <w:rFonts w:ascii="Liberation Sans" w:hAnsi="Liberation Sans"/>
-          <w:sz w:val="24"/>
-          <w:szCs w:val="24"/>
-        </w:rPr>
-        <w:t xml:space="preserve">│   │   ├── </w:t>
-      </w:r>
-      <w:r>
-        <w:rPr>
-          <w:rFonts w:ascii="Liberation Sans" w:hAnsi="Liberation Sans"/>
-          <w:sz w:val="24"/>
-          <w:szCs w:val="24"/>
-        </w:rPr>
-        <w:t>elo.ts</w:t>
-      </w:r>
-    </w:p>
-    <w:p>
-      <w:pPr>
-        <w:pStyle w:val="BodyText"/>
-        <w:bidi w:val="0"/>
-        <w:jc w:val="left"/>
-        <w:rPr>
-          <w:rFonts w:ascii="Liberation Sans" w:hAnsi="Liberation Sans"/>
-          <w:sz w:val="24"/>
-          <w:szCs w:val="24"/>
-        </w:rPr>
-      </w:pPr>
-      <w:r>
-        <w:rPr>
-          <w:rFonts w:ascii="Liberation Sans" w:hAnsi="Liberation Sans"/>
-          <w:sz w:val="24"/>
-          <w:szCs w:val="24"/>
-        </w:rPr>
-        <w:t xml:space="preserve">│   │   ├── </w:t>
-      </w:r>
-      <w:r>
-        <w:rPr>
-          <w:rFonts w:ascii="Liberation Sans" w:hAnsi="Liberation Sans"/>
-          <w:sz w:val="24"/>
-          <w:szCs w:val="24"/>
-        </w:rPr>
-        <w:t>get-problem.ts</w:t>
-      </w:r>
-    </w:p>
-    <w:p>
-      <w:pPr>
-        <w:pStyle w:val="BodyText"/>
-        <w:bidi w:val="0"/>
-        <w:jc w:val="left"/>
-        <w:rPr>
-          <w:rFonts w:ascii="Liberation Sans" w:hAnsi="Liberation Sans"/>
-          <w:sz w:val="24"/>
-          <w:szCs w:val="24"/>
-        </w:rPr>
-      </w:pPr>
-      <w:r>
-        <w:rPr>
-          <w:rFonts w:ascii="Liberation Sans" w:hAnsi="Liberation Sans"/>
-          <w:sz w:val="24"/>
-          <w:szCs w:val="24"/>
-        </w:rPr>
-        <w:t xml:space="preserve">│   │   ├── </w:t>
-      </w:r>
-      <w:r>
-        <w:rPr>
-          <w:rFonts w:ascii="Liberation Sans" w:hAnsi="Liberation Sans"/>
-          <w:sz w:val="24"/>
-          <w:szCs w:val="24"/>
-        </w:rPr>
-        <w:t>get-session.ts</w:t>
-      </w:r>
-    </w:p>
-    <w:p>
-      <w:pPr>
-        <w:pStyle w:val="BodyText"/>
-        <w:bidi w:val="0"/>
-        <w:jc w:val="left"/>
-        <w:rPr>
-          <w:rFonts w:ascii="Liberation Sans" w:hAnsi="Liberation Sans"/>
-          <w:sz w:val="24"/>
-          <w:szCs w:val="24"/>
-        </w:rPr>
-      </w:pPr>
-      <w:r>
-        <w:rPr>
-          <w:rFonts w:ascii="Liberation Sans" w:hAnsi="Liberation Sans"/>
-          <w:sz w:val="24"/>
-          <w:szCs w:val="24"/>
-        </w:rPr>
-        <w:t xml:space="preserve">│   │   ├── </w:t>
-      </w:r>
-      <w:r>
-        <w:rPr>
-          <w:rFonts w:ascii="Liberation Sans" w:hAnsi="Liberation Sans"/>
-          <w:sz w:val="24"/>
-          <w:szCs w:val="24"/>
-        </w:rPr>
-        <w:t>index.ts</w:t>
-      </w:r>
-    </w:p>
-    <w:p>
-      <w:pPr>
-        <w:pStyle w:val="BodyText"/>
-        <w:bidi w:val="0"/>
-        <w:jc w:val="left"/>
-        <w:rPr>
-          <w:rFonts w:ascii="Liberation Sans" w:hAnsi="Liberation Sans"/>
-          <w:sz w:val="24"/>
-          <w:szCs w:val="24"/>
-        </w:rPr>
-      </w:pPr>
-      <w:r>
-        <w:rPr>
-          <w:rFonts w:ascii="Liberation Sans" w:hAnsi="Liberation Sans"/>
-          <w:sz w:val="24"/>
-          <w:szCs w:val="24"/>
-        </w:rPr>
-        <w:t xml:space="preserve">│   │   ├── </w:t>
-      </w:r>
-      <w:r>
-        <w:rPr>
-          <w:rFonts w:ascii="Liberation Sans" w:hAnsi="Liberation Sans"/>
-          <w:sz w:val="24"/>
-          <w:szCs w:val="24"/>
-        </w:rPr>
-        <w:t>problem.ts</w:t>
-      </w:r>
-    </w:p>
-    <w:p>
-      <w:pPr>
-        <w:pStyle w:val="BodyText"/>
-        <w:bidi w:val="0"/>
-        <w:jc w:val="left"/>
-        <w:rPr>
-          <w:rFonts w:ascii="Liberation Sans" w:hAnsi="Liberation Sans"/>
-          <w:sz w:val="24"/>
-          <w:szCs w:val="24"/>
-        </w:rPr>
-      </w:pPr>
-      <w:r>
-        <w:rPr>
-          <w:rFonts w:ascii="Liberation Sans" w:hAnsi="Liberation Sans"/>
-          <w:sz w:val="24"/>
-          <w:szCs w:val="24"/>
-        </w:rPr>
-        <w:t xml:space="preserve">│   │   ├── </w:t>
-      </w:r>
-      <w:r>
-        <w:rPr>
-          <w:rFonts w:ascii="Liberation Sans" w:hAnsi="Liberation Sans"/>
-          <w:sz w:val="24"/>
-          <w:szCs w:val="24"/>
-        </w:rPr>
-        <w:t>search-request.ts</w:t>
-      </w:r>
-    </w:p>
-    <w:p>
-      <w:pPr>
-        <w:pStyle w:val="BodyText"/>
-        <w:bidi w:val="0"/>
-        <w:jc w:val="left"/>
-        <w:rPr>
-          <w:rFonts w:ascii="Liberation Sans" w:hAnsi="Liberation Sans"/>
-          <w:sz w:val="24"/>
-          <w:szCs w:val="24"/>
-        </w:rPr>
-      </w:pPr>
-      <w:r>
-        <w:rPr>
-          <w:rFonts w:ascii="Liberation Sans" w:hAnsi="Liberation Sans"/>
-          <w:sz w:val="24"/>
-          <w:szCs w:val="24"/>
-        </w:rPr>
-        <w:t xml:space="preserve">│   │   ├── </w:t>
-      </w:r>
-      <w:r>
-        <w:rPr>
-          <w:rFonts w:ascii="Liberation Sans" w:hAnsi="Liberation Sans"/>
-          <w:sz w:val="24"/>
-          <w:szCs w:val="24"/>
-        </w:rPr>
-        <w:t>submit-login.ts</w:t>
-      </w:r>
-    </w:p>
-    <w:p>
-      <w:pPr>
-        <w:pStyle w:val="BodyText"/>
-        <w:bidi w:val="0"/>
-        <w:jc w:val="left"/>
-        <w:rPr>
-          <w:rFonts w:ascii="Liberation Sans" w:hAnsi="Liberation Sans"/>
-          <w:sz w:val="24"/>
-          <w:szCs w:val="24"/>
-        </w:rPr>
-      </w:pPr>
-      <w:r>
-        <w:rPr>
-          <w:rFonts w:ascii="Liberation Sans" w:hAnsi="Liberation Sans"/>
-          <w:sz w:val="24"/>
-          <w:szCs w:val="24"/>
-        </w:rPr>
-        <w:t xml:space="preserve">│   │   ├── </w:t>
-      </w:r>
-      <w:r>
-        <w:rPr>
-          <w:rFonts w:ascii="Liberation Sans" w:hAnsi="Liberation Sans"/>
-          <w:sz w:val="24"/>
-          <w:szCs w:val="24"/>
-        </w:rPr>
-        <w:t>submit-signup.ts</w:t>
-      </w:r>
-    </w:p>
-    <w:p>
-      <w:pPr>
-        <w:pStyle w:val="BodyText"/>
-        <w:bidi w:val="0"/>
-        <w:jc w:val="left"/>
-        <w:rPr>
-          <w:rFonts w:ascii="Liberation Sans" w:hAnsi="Liberation Sans"/>
-          <w:sz w:val="24"/>
-          <w:szCs w:val="24"/>
-        </w:rPr>
-      </w:pPr>
-      <w:r>
-        <w:rPr>
-          <w:rFonts w:ascii="Liberation Sans" w:hAnsi="Liberation Sans"/>
-          <w:sz w:val="24"/>
-          <w:szCs w:val="24"/>
-        </w:rPr>
-        <w:t xml:space="preserve">│   │   └── </w:t>
-      </w:r>
-      <w:r>
-        <w:rPr>
-          <w:rFonts w:ascii="Liberation Sans" w:hAnsi="Liberation Sans"/>
-          <w:sz w:val="24"/>
-          <w:szCs w:val="24"/>
-        </w:rPr>
-        <w:t>user.ts</w:t>
-      </w:r>
-    </w:p>
-    <w:p>
-      <w:pPr>
-        <w:pStyle w:val="BodyText"/>
-        <w:bidi w:val="0"/>
-        <w:jc w:val="left"/>
-        <w:rPr>
-          <w:rFonts w:ascii="Liberation Sans" w:hAnsi="Liberation Sans"/>
-          <w:sz w:val="24"/>
-          <w:szCs w:val="24"/>
-        </w:rPr>
-      </w:pPr>
-      <w:r>
-        <w:rPr>
-          <w:rFonts w:ascii="Liberation Sans" w:hAnsi="Liberation Sans"/>
-          <w:sz w:val="24"/>
-          <w:szCs w:val="24"/>
-        </w:rPr>
-        <w:t xml:space="preserve">│   └── </w:t>
-      </w:r>
-      <w:r>
-        <w:rPr>
-          <w:rFonts w:ascii="Liberation Sans" w:hAnsi="Liberation Sans"/>
-          <w:sz w:val="24"/>
-          <w:szCs w:val="24"/>
-        </w:rPr>
-        <w:t>server.ts</w:t>
-      </w:r>
-    </w:p>
-    <w:p>
-      <w:pPr>
-        <w:pStyle w:val="BodyText"/>
-        <w:bidi w:val="0"/>
-        <w:jc w:val="left"/>
-        <w:rPr>
-          <w:rFonts w:ascii="Liberation Sans" w:hAnsi="Liberation Sans"/>
-          <w:sz w:val="24"/>
-          <w:szCs w:val="24"/>
-        </w:rPr>
-      </w:pPr>
-      <w:r>
-        <w:rPr>
-          <w:rFonts w:ascii="Liberation Sans" w:hAnsi="Liberation Sans"/>
-          <w:sz w:val="24"/>
-          <w:szCs w:val="24"/>
-        </w:rPr>
-        <w:t xml:space="preserve">├── </w:t>
-      </w:r>
-      <w:r>
-        <w:rPr>
-          <w:rFonts w:ascii="Liberation Sans" w:hAnsi="Liberation Sans"/>
-          <w:sz w:val="24"/>
-          <w:szCs w:val="24"/>
-        </w:rPr>
-        <w:t>tsconfig.frontend.json</w:t>
-      </w:r>
-    </w:p>
-    <w:p>
-      <w:pPr>
-        <w:pStyle w:val="BodyText"/>
-        <w:bidi w:val="0"/>
-        <w:jc w:val="left"/>
-        <w:rPr>
-          <w:rFonts w:ascii="Liberation Sans" w:hAnsi="Liberation Sans"/>
-          <w:sz w:val="24"/>
-          <w:szCs w:val="24"/>
-        </w:rPr>
-      </w:pPr>
-      <w:r>
-        <w:rPr>
-          <w:rFonts w:ascii="Liberation Sans" w:hAnsi="Liberation Sans"/>
-          <w:sz w:val="24"/>
-          <w:szCs w:val="24"/>
-        </w:rPr>
-        <w:t xml:space="preserve">├── </w:t>
-      </w:r>
-      <w:r>
-        <w:rPr>
-          <w:rFonts w:ascii="Liberation Sans" w:hAnsi="Liberation Sans"/>
-          <w:sz w:val="24"/>
-          <w:szCs w:val="24"/>
-        </w:rPr>
-        <w:t>tsconfig.json</w:t>
-      </w:r>
-    </w:p>
-    <w:p>
-      <w:pPr>
-        <w:pStyle w:val="BodyText"/>
-        <w:bidi w:val="0"/>
-        <w:jc w:val="left"/>
-        <w:rPr>
-          <w:rFonts w:ascii="Liberation Sans" w:hAnsi="Liberation Sans"/>
-          <w:sz w:val="24"/>
-          <w:szCs w:val="24"/>
-        </w:rPr>
-      </w:pPr>
-      <w:r>
-        <w:rPr>
-          <w:rFonts w:ascii="Liberation Sans" w:hAnsi="Liberation Sans"/>
-          <w:sz w:val="24"/>
-          <w:szCs w:val="24"/>
-        </w:rPr>
-        <w:t xml:space="preserve">├── </w:t>
-      </w:r>
-      <w:r>
-        <w:rPr>
-          <w:rFonts w:ascii="Liberation Sans" w:hAnsi="Liberation Sans"/>
-          <w:sz w:val="24"/>
-          <w:szCs w:val="24"/>
-        </w:rPr>
         <w:t>tsconfig.public.json</w:t>
       </w:r>
     </w:p>
@@ -4685,8 +4253,6 @@
         <w:jc w:val="left"/>
         <w:rPr>
           <w:rFonts w:ascii="Liberation Sans" w:hAnsi="Liberation Sans"/>
-          <w:sz w:val="24"/>
-          <w:szCs w:val="24"/>
         </w:rPr>
       </w:pPr>
       <w:r>
@@ -4713,8 +4279,6 @@
         <w:jc w:val="left"/>
         <w:rPr>
           <w:rFonts w:ascii="Liberation Sans" w:hAnsi="Liberation Sans"/>
-          <w:sz w:val="24"/>
-          <w:szCs w:val="24"/>
         </w:rPr>
       </w:pPr>
       <w:r>
@@ -4741,8 +4305,6 @@
         <w:jc w:val="left"/>
         <w:rPr>
           <w:rFonts w:ascii="Liberation Sans" w:hAnsi="Liberation Sans"/>
-          <w:sz w:val="24"/>
-          <w:szCs w:val="24"/>
         </w:rPr>
       </w:pPr>
       <w:r>
@@ -4769,8 +4331,6 @@
         <w:jc w:val="left"/>
         <w:rPr>
           <w:rFonts w:ascii="Liberation Sans" w:hAnsi="Liberation Sans"/>
-          <w:sz w:val="24"/>
-          <w:szCs w:val="24"/>
         </w:rPr>
       </w:pPr>
       <w:r>
@@ -4797,8 +4357,6 @@
         <w:jc w:val="left"/>
         <w:rPr>
           <w:rFonts w:ascii="Liberation Sans" w:hAnsi="Liberation Sans"/>
-          <w:sz w:val="24"/>
-          <w:szCs w:val="24"/>
         </w:rPr>
       </w:pPr>
       <w:r>
@@ -4825,8 +4383,6 @@
         <w:jc w:val="left"/>
         <w:rPr>
           <w:rFonts w:ascii="Liberation Sans" w:hAnsi="Liberation Sans"/>
-          <w:sz w:val="24"/>
-          <w:szCs w:val="24"/>
         </w:rPr>
       </w:pPr>
       <w:r>
@@ -4853,8 +4409,6 @@
         <w:jc w:val="left"/>
         <w:rPr>
           <w:rFonts w:ascii="Liberation Sans" w:hAnsi="Liberation Sans"/>
-          <w:sz w:val="24"/>
-          <w:szCs w:val="24"/>
         </w:rPr>
       </w:pPr>
       <w:r>
@@ -4881,8 +4435,6 @@
         <w:jc w:val="left"/>
         <w:rPr>
           <w:rFonts w:ascii="Liberation Sans" w:hAnsi="Liberation Sans"/>
-          <w:sz w:val="24"/>
-          <w:szCs w:val="24"/>
         </w:rPr>
       </w:pPr>
       <w:r>
@@ -4909,8 +4461,6 @@
         <w:jc w:val="left"/>
         <w:rPr>
           <w:rFonts w:ascii="Liberation Sans" w:hAnsi="Liberation Sans"/>
-          <w:sz w:val="24"/>
-          <w:szCs w:val="24"/>
         </w:rPr>
       </w:pPr>
       <w:r>
@@ -4937,8 +4487,6 @@
         <w:jc w:val="left"/>
         <w:rPr>
           <w:rFonts w:ascii="Liberation Sans" w:hAnsi="Liberation Sans"/>
-          <w:sz w:val="24"/>
-          <w:szCs w:val="24"/>
         </w:rPr>
       </w:pPr>
       <w:r>
@@ -4965,8 +4513,6 @@
         <w:jc w:val="left"/>
         <w:rPr>
           <w:rFonts w:ascii="Liberation Sans" w:hAnsi="Liberation Sans"/>
-          <w:sz w:val="24"/>
-          <w:szCs w:val="24"/>
         </w:rPr>
       </w:pPr>
       <w:r>
@@ -4993,8 +4539,6 @@
         <w:jc w:val="left"/>
         <w:rPr>
           <w:rFonts w:ascii="Liberation Sans" w:hAnsi="Liberation Sans"/>
-          <w:sz w:val="24"/>
-          <w:szCs w:val="24"/>
         </w:rPr>
       </w:pPr>
       <w:r>
@@ -5021,8 +4565,6 @@
         <w:jc w:val="left"/>
         <w:rPr>
           <w:rFonts w:ascii="Liberation Sans" w:hAnsi="Liberation Sans"/>
-          <w:sz w:val="24"/>
-          <w:szCs w:val="24"/>
         </w:rPr>
       </w:pPr>
       <w:r>
@@ -5049,45 +4591,43 @@
         <w:jc w:val="left"/>
         <w:rPr>
           <w:rFonts w:ascii="Liberation Sans" w:hAnsi="Liberation Sans"/>
-          <w:sz w:val="24"/>
-          <w:szCs w:val="24"/>
-        </w:rPr>
-      </w:pPr>
-      <w:r>
-        <w:rPr>
-          <w:rFonts w:ascii="Liberation Sans" w:hAnsi="Liberation Sans"/>
-          <w:sz w:val="24"/>
-          <w:szCs w:val="24"/>
-        </w:rPr>
-      </w:r>
-    </w:p>
-    <w:p>
-      <w:pPr>
-        <w:pStyle w:val="BodyText"/>
-        <w:bidi w:val="0"/>
-        <w:jc w:val="left"/>
-        <w:rPr>
-          <w:rFonts w:ascii="Liberation Sans" w:hAnsi="Liberation Sans"/>
-          <w:sz w:val="24"/>
-          <w:szCs w:val="24"/>
-        </w:rPr>
-      </w:pPr>
-      <w:r>
-        <w:rPr>
-          <w:rFonts w:ascii="Liberation Sans" w:hAnsi="Liberation Sans"/>
-          <w:sz w:val="24"/>
-          <w:szCs w:val="24"/>
-        </w:rPr>
-        <w:t>12 directories, 53 files</w:t>
-      </w:r>
-    </w:p>
-    <w:p>
-      <w:pPr>
-        <w:pStyle w:val="BodyText"/>
-        <w:bidi w:val="0"/>
-        <w:jc w:val="left"/>
-        <w:rPr>
-          <w:rFonts w:ascii="Liberation Sans" w:hAnsi="Liberation Sans"/>
+        </w:rPr>
+      </w:pPr>
+      <w:r>
+        <w:rPr>
+          <w:rFonts w:ascii="Liberation Sans" w:hAnsi="Liberation Sans"/>
+          <w:sz w:val="24"/>
+          <w:szCs w:val="24"/>
+        </w:rPr>
+      </w:r>
+    </w:p>
+    <w:p>
+      <w:pPr>
+        <w:pStyle w:val="BodyText"/>
+        <w:bidi w:val="0"/>
+        <w:jc w:val="left"/>
+        <w:rPr>
+          <w:rFonts w:ascii="Liberation Sans" w:hAnsi="Liberation Sans"/>
+        </w:rPr>
+      </w:pPr>
+      <w:r>
+        <w:rPr>
+          <w:rFonts w:ascii="Liberation Sans" w:hAnsi="Liberation Sans"/>
+          <w:sz w:val="24"/>
+          <w:szCs w:val="24"/>
+        </w:rPr>
+        <w:t>11 directories, 50 files</w:t>
+      </w:r>
+    </w:p>
+    <w:p>
+      <w:pPr>
+        <w:pStyle w:val="BodyText"/>
+        <w:bidi w:val="0"/>
+        <w:jc w:val="left"/>
+        <w:rPr>
+          <w:rFonts w:ascii="Liberation Sans" w:hAnsi="Liberation Sans"/>
+          <w:sz w:val="24"/>
+          <w:szCs w:val="24"/>
         </w:rPr>
       </w:pPr>
       <w:r>
@@ -5127,76 +4667,60 @@
           <w:sz w:val="28"/>
           <w:szCs w:val="28"/>
         </w:rPr>
-        <w:t xml:space="preserve">HCI (Human-computer interaction) / </w:t>
-      </w:r>
-      <w:r>
-        <w:rPr>
-          <w:rFonts w:ascii="Liberation Sans" w:hAnsi="Liberation Sans"/>
+        <w:t>HCI (Human-computer interaction) / Front end design:</w:t>
+      </w:r>
+    </w:p>
+    <w:p>
+      <w:pPr>
+        <w:pStyle w:val="BodyText"/>
+        <w:bidi w:val="0"/>
+        <w:jc w:val="left"/>
+        <w:rPr>
+          <w:rFonts w:ascii="Liberation Sans" w:hAnsi="Liberation Sans"/>
+          <w:sz w:val="24"/>
+          <w:szCs w:val="24"/>
+        </w:rPr>
+      </w:pPr>
+      <w:r>
+        <w:rPr>
+          <w:rFonts w:ascii="Liberation Sans" w:hAnsi="Liberation Sans"/>
+          <w:sz w:val="24"/>
+          <w:szCs w:val="24"/>
+        </w:rPr>
+        <w:t>My goal for interactivity is to make it as useful yet simple as possible. In this case, creating the underlying software is much more significant so making the frontend of the website get to the point will benefit all parties involved. I want the site to look simple and composed, with a readable font, colour scheme and most convenience. Thankfully, Javascript has an abundance of frontend documentation and libraries.</w:t>
+      </w:r>
+    </w:p>
+    <w:p>
+      <w:pPr>
+        <w:pStyle w:val="BodyText"/>
+        <w:bidi w:val="0"/>
+        <w:jc w:val="left"/>
+        <w:rPr>
+          <w:rFonts w:ascii="Liberation Sans" w:hAnsi="Liberation Sans"/>
+        </w:rPr>
+      </w:pPr>
+      <w:r>
+        <w:rPr>
+          <w:rFonts w:ascii="Liberation Sans" w:hAnsi="Liberation Sans"/>
+        </w:rPr>
+      </w:r>
+    </w:p>
+    <w:p>
+      <w:pPr>
+        <w:pStyle w:val="BodyText"/>
+        <w:bidi w:val="0"/>
+        <w:jc w:val="left"/>
+        <w:rPr>
           <w:sz w:val="28"/>
           <w:szCs w:val="28"/>
         </w:rPr>
-        <w:t>Front end</w:t>
-      </w:r>
+      </w:pPr>
       <w:r>
         <w:rPr>
           <w:rFonts w:ascii="Liberation Sans" w:hAnsi="Liberation Sans"/>
           <w:sz w:val="28"/>
           <w:szCs w:val="28"/>
         </w:rPr>
-        <w:t xml:space="preserve"> design:</w:t>
-      </w:r>
-    </w:p>
-    <w:p>
-      <w:pPr>
-        <w:pStyle w:val="BodyText"/>
-        <w:bidi w:val="0"/>
-        <w:jc w:val="left"/>
-        <w:rPr>
-          <w:rFonts w:ascii="Liberation Sans" w:hAnsi="Liberation Sans"/>
-          <w:sz w:val="24"/>
-          <w:szCs w:val="24"/>
-        </w:rPr>
-      </w:pPr>
-      <w:r>
-        <w:rPr>
-          <w:rFonts w:ascii="Liberation Sans" w:hAnsi="Liberation Sans"/>
-          <w:sz w:val="24"/>
-          <w:szCs w:val="24"/>
-        </w:rPr>
-        <w:t>My goal for interactivity is to make it as useful yet simple as possible. In this case, creating the underlying software is much more significant so making the frontend of the website get to the point will benefit all parties involved. I want the site to look simple and composed, with a readable font, colour scheme and most convenience. Thankfully, Javascript has an abundance of frontend documentation and libraries.</w:t>
-      </w:r>
-    </w:p>
-    <w:p>
-      <w:pPr>
-        <w:pStyle w:val="BodyText"/>
-        <w:bidi w:val="0"/>
-        <w:jc w:val="left"/>
-        <w:rPr>
-          <w:rFonts w:ascii="Liberation Sans" w:hAnsi="Liberation Sans"/>
-        </w:rPr>
-      </w:pPr>
-      <w:r>
-        <w:rPr>
-          <w:rFonts w:ascii="Liberation Sans" w:hAnsi="Liberation Sans"/>
-        </w:rPr>
-      </w:r>
-    </w:p>
-    <w:p>
-      <w:pPr>
-        <w:pStyle w:val="BodyText"/>
-        <w:bidi w:val="0"/>
-        <w:jc w:val="left"/>
-        <w:rPr>
-          <w:sz w:val="28"/>
-          <w:szCs w:val="28"/>
-        </w:rPr>
-      </w:pPr>
-      <w:r>
-        <w:rPr>
-          <w:rFonts w:ascii="Liberation Sans" w:hAnsi="Liberation Sans"/>
-          <w:sz w:val="28"/>
-          <w:szCs w:val="28"/>
-        </w:rPr>
         <w:t>Hardware selection:</w:t>
       </w:r>
     </w:p>
@@ -5213,25 +4737,19 @@
         <w:rPr>
           <w:rFonts w:ascii="Liberation Sans" w:hAnsi="Liberation Sans"/>
         </w:rPr>
-        <w:t>I'm making use of standard hardware (</w:t>
-      </w:r>
-      <w:r>
-        <w:rPr>
-          <w:rFonts w:ascii="Liberation Sans" w:hAnsi="Liberation Sans"/>
-        </w:rPr>
-        <w:t>an AMD64 arch laptop)</w:t>
-      </w:r>
-      <w:r>
-        <w:rPr>
-          <w:rFonts w:ascii="Liberation Sans" w:hAnsi="Liberation Sans"/>
-        </w:rPr>
-        <w:t xml:space="preserve">, however, the operating system </w:t>
-      </w:r>
-      <w:r>
-        <w:rPr>
-          <w:rFonts w:ascii="Liberation Sans" w:hAnsi="Liberation Sans"/>
-        </w:rPr>
-        <w:t>is far from standard.</w:t>
+        <w:t xml:space="preserve">I'm making use of standard hardware (an </w:t>
+      </w:r>
+      <w:r>
+        <w:rPr>
+          <w:rFonts w:ascii="Liberation Sans" w:hAnsi="Liberation Sans"/>
+        </w:rPr>
+        <w:t>x86-64</w:t>
+      </w:r>
+      <w:r>
+        <w:rPr>
+          <w:rFonts w:ascii="Liberation Sans" w:hAnsi="Liberation Sans"/>
+        </w:rPr>
+        <w:t xml:space="preserve"> laptop), however, the operating system is far from standard.</w:t>
       </w:r>
     </w:p>
     <w:p>
@@ -5248,16 +4766,8 @@
           <w:sz w:val="24"/>
           <w:szCs w:val="24"/>
         </w:rPr>
-        <w:t xml:space="preserve">Using a distribution of Linux on my laptop (nixos), and linux being inspired by unix (an older family of operating systems) philosophy, file paths are denoted using forward slashes (/home/gabriel/hi.txt) rather than backward slashes (C:\Users\Gabriel\hi.txt). NodeJS does provide a method of mitigating the compatibility issue, but that’s uneccessary. </w:t>
-      </w:r>
-    </w:p>
-    <w:p>
-      <w:pPr>
-        <w:pStyle w:val="BodyText"/>
-        <w:bidi w:val="0"/>
-        <w:jc w:val="left"/>
-        <w:rPr/>
-      </w:pPr>
+        <w:t>Using a distribution of Linux on my laptop (nixos), and linux being inspired by unix (an</w:t>
+      </w:r>
       <w:r>
         <w:rPr>
           <w:rStyle w:val="SourceText"/>
@@ -5265,7 +4775,96 @@
           <w:sz w:val="24"/>
           <w:szCs w:val="24"/>
         </w:rPr>
-        <w:t xml:space="preserve">I say so since the product is to be accessed using a web browser and the HTTP server should be ran on the most optimal and efficient platform, which in this case is linux/unix. According to w3techs, in 2026, 91% of website servers run on linux/unix (which actually is pretty low considering that windows provides no advantage for server use). </w:t>
+        <w:t>other</w:t>
+      </w:r>
+      <w:r>
+        <w:rPr>
+          <w:rStyle w:val="SourceText"/>
+          <w:rFonts w:ascii="Liberation Sans" w:hAnsi="Liberation Sans"/>
+          <w:sz w:val="24"/>
+          <w:szCs w:val="24"/>
+        </w:rPr>
+        <w:t xml:space="preserve"> family of operating systems) philosophy, file paths are denoted using forward slashes (/home/gabriel/hi.txt) rather than backward slashes (C:\Users\Gabriel\hi.txt). NodeJS does provide a method of mitigating the compatibility issue, but that’s uneccessary. </w:t>
+      </w:r>
+    </w:p>
+    <w:p>
+      <w:pPr>
+        <w:pStyle w:val="BodyText"/>
+        <w:bidi w:val="0"/>
+        <w:jc w:val="left"/>
+        <w:rPr/>
+      </w:pPr>
+      <w:r>
+        <w:rPr>
+          <w:rStyle w:val="SourceText"/>
+          <w:rFonts w:ascii="Liberation Sans" w:hAnsi="Liberation Sans"/>
+          <w:sz w:val="24"/>
+          <w:szCs w:val="24"/>
+        </w:rPr>
+        <w:t>I say so since the product is to be accessed using a web browse</w:t>
+      </w:r>
+      <w:r>
+        <w:rPr>
+          <w:rStyle w:val="SourceText"/>
+          <w:rFonts w:ascii="Liberation Sans" w:hAnsi="Liberation Sans"/>
+          <w:sz w:val="24"/>
+          <w:szCs w:val="24"/>
+        </w:rPr>
+        <w:t>r, or in short, any operating system</w:t>
+      </w:r>
+      <w:r>
+        <w:rPr>
+          <w:rStyle w:val="SourceText"/>
+          <w:rFonts w:ascii="Liberation Sans" w:hAnsi="Liberation Sans"/>
+          <w:sz w:val="24"/>
+          <w:szCs w:val="24"/>
+        </w:rPr>
+        <w:t xml:space="preserve">. </w:t>
+      </w:r>
+      <w:r>
+        <w:rPr>
+          <w:rStyle w:val="SourceText"/>
+          <w:rFonts w:ascii="Liberation Sans" w:hAnsi="Liberation Sans"/>
+          <w:sz w:val="24"/>
+          <w:szCs w:val="24"/>
+        </w:rPr>
+        <w:t xml:space="preserve">This allows the </w:t>
+      </w:r>
+      <w:r>
+        <w:rPr>
+          <w:rStyle w:val="SourceText"/>
+          <w:rFonts w:ascii="Liberation Sans" w:hAnsi="Liberation Sans"/>
+          <w:sz w:val="24"/>
+          <w:szCs w:val="24"/>
+        </w:rPr>
+        <w:t xml:space="preserve">HTTP server to </w:t>
+      </w:r>
+      <w:r>
+        <w:rPr>
+          <w:rStyle w:val="SourceText"/>
+          <w:rFonts w:ascii="Liberation Sans" w:hAnsi="Liberation Sans"/>
+          <w:sz w:val="24"/>
+          <w:szCs w:val="24"/>
+        </w:rPr>
+        <w:t xml:space="preserve">be </w:t>
+      </w:r>
+      <w:r>
+        <w:rPr>
+          <w:rStyle w:val="SourceText"/>
+          <w:rFonts w:ascii="Liberation Sans" w:hAnsi="Liberation Sans"/>
+          <w:sz w:val="24"/>
+          <w:szCs w:val="24"/>
+        </w:rPr>
+        <w:t xml:space="preserve">ran </w:t>
+      </w:r>
+      <w:r>
+        <w:rPr>
+          <w:rStyle w:val="SourceText"/>
+          <w:rFonts w:ascii="Liberation Sans" w:hAnsi="Liberation Sans"/>
+          <w:sz w:val="24"/>
+          <w:szCs w:val="24"/>
+        </w:rPr>
+        <w:t xml:space="preserve">on the most optimal and efficient platform, which in this case is linux/unix. According to w3techs, 91% of web servers in 2026 run on linux/unix. </w:t>
       </w:r>
     </w:p>
     <w:p>
@@ -5303,7 +4902,7 @@
           <w:sz w:val="24"/>
           <w:szCs w:val="24"/>
         </w:rPr>
-        <w:t>Better philosophy, for example “everything is a file” and programs attempting to “do one thing, and do it well”,</w:t>
+        <w:t xml:space="preserve">Better philosophy, for example “everything is a file” and programs attempting to “do one thing, and do it well”, </w:t>
       </w:r>
     </w:p>
     <w:p>
@@ -5324,7 +4923,16 @@
           <w:sz w:val="24"/>
           <w:szCs w:val="24"/>
         </w:rPr>
-        <w:t>Ethics and safety due to open sourcing since anyone can inspect parts for security and code quality. Vulnurabilities are dealt with quickly and transparently,</w:t>
+        <w:t xml:space="preserve">Ethics and safety due to open sourcing since anyone can inspect parts for security and code quality. Vulnurabilities are dealt with quickly and transparently, </w:t>
+      </w:r>
+      <w:r>
+        <w:rPr>
+          <w:rStyle w:val="SourceText"/>
+          <w:rFonts w:ascii="Liberation Sans" w:hAnsi="Liberation Sans"/>
+          <w:sz w:val="24"/>
+          <w:szCs w:val="24"/>
+        </w:rPr>
+        <w:t>and most importantly, it’s free of charge with no strings attached,</w:t>
       </w:r>
     </w:p>
     <w:p>
@@ -5356,7 +4964,16 @@
           <w:sz w:val="24"/>
           <w:szCs w:val="24"/>
         </w:rPr>
-        <w:t>etter tooling for softare engineering, with a better terminal experience (bash/zsh, customization), package management and native tools/server software (git for example),</w:t>
+        <w:t xml:space="preserve">etter tooling for </w:t>
+      </w:r>
+      <w:r>
+        <w:rPr>
+          <w:rStyle w:val="SourceText"/>
+          <w:rFonts w:ascii="Liberation Sans" w:hAnsi="Liberation Sans"/>
+          <w:sz w:val="24"/>
+          <w:szCs w:val="24"/>
+        </w:rPr>
+        <w:t>this job. The bash shell is easier and more powerful than powershell, and package management means that updating and managing software on the device is easier.</w:t>
       </w:r>
     </w:p>
     <w:p>
@@ -5377,7 +4994,7 @@
           <w:sz w:val="24"/>
           <w:szCs w:val="24"/>
         </w:rPr>
-        <w:t xml:space="preserve">More efficient use of resources since the core parts of the linux kernel are complete, so are either </w:t>
+        <w:t xml:space="preserve">More efficient use of resources since the core parts of the linux kernel </w:t>
       </w:r>
       <w:r>
         <w:rPr>
@@ -5385,18 +5002,8 @@
           <w:rFonts w:ascii="Liberation Sans" w:hAnsi="Liberation Sans"/>
           <w:sz w:val="24"/>
           <w:szCs w:val="24"/>
-          <w:u w:val="none"/>
-        </w:rPr>
-        <w:t>maintainance</w:t>
-      </w:r>
-      <w:r>
-        <w:rPr>
-          <w:rStyle w:val="SourceText"/>
-          <w:rFonts w:ascii="Liberation Sans" w:hAnsi="Liberation Sans"/>
-          <w:sz w:val="24"/>
-          <w:szCs w:val="24"/>
-        </w:rPr>
-        <w:t xml:space="preserve"> (most of the time) or optimization.</w:t>
+        </w:rPr>
+        <w:t>have either been hyper-optimized, or alternate between optimization and maintainance.</w:t>
       </w:r>
     </w:p>
     <w:p>
@@ -5613,17 +5220,7 @@
           <w:sz w:val="32"/>
           <w:szCs w:val="32"/>
         </w:rPr>
-        <w:t>Technical solution</w:t>
-      </w:r>
-      <w:r>
-        <w:rPr>
-          <w:rFonts w:ascii="Liberation Sans" w:hAnsi="Liberation Sans"/>
-          <w:b/>
-          <w:bCs/>
-          <w:sz w:val="32"/>
-          <w:szCs w:val="32"/>
-        </w:rPr>
-        <w:t>:</w:t>
+        <w:t>Technical solution:</w:t>
       </w:r>
     </w:p>
     <w:p>
@@ -5690,26 +5287,32 @@
         </w:rPr>
       </w:pPr>
       <w:r>
-        <w:rPr/>
-      </w:r>
-    </w:p>
-    <w:p>
-      <w:pPr>
-        <w:pStyle w:val="BodyText"/>
-        <w:bidi w:val="0"/>
-        <w:spacing w:before="0" w:after="140"/>
-        <w:jc w:val="left"/>
         <w:rPr>
           <w:rFonts w:ascii="Liberation Sans" w:hAnsi="Liberation Sans"/>
           <w:b w:val="false"/>
           <w:bCs w:val="false"/>
-          <w:sz w:val="24"/>
-          <w:szCs w:val="24"/>
-        </w:rPr>
-      </w:pPr>
-      <w:r>
-        <w:rPr>
-          <w:rFonts w:ascii="JetBrainsMonoNL NFM" w:hAnsi="JetBrainsMonoNL NFM"/>
+          <w:sz w:val="28"/>
+          <w:szCs w:val="28"/>
+        </w:rPr>
+      </w:r>
+    </w:p>
+    <w:p>
+      <w:pPr>
+        <w:pStyle w:val="BodyText"/>
+        <w:bidi w:val="0"/>
+        <w:spacing w:before="0" w:after="140"/>
+        <w:jc w:val="left"/>
+        <w:rPr>
+          <w:rFonts w:ascii="Liberation Sans" w:hAnsi="Liberation Sans"/>
+          <w:b w:val="false"/>
+          <w:bCs w:val="false"/>
+          <w:sz w:val="24"/>
+          <w:szCs w:val="24"/>
+        </w:rPr>
+      </w:pPr>
+      <w:r>
+        <w:rPr>
+          <w:rFonts w:ascii="Liberation Sans" w:hAnsi="Liberation Sans"/>
           <w:b w:val="false"/>
           <w:bCs w:val="false"/>
           <w:sz w:val="24"/>
@@ -5768,7 +5371,7 @@
     </w:r>
     <w:r>
       <w:rPr/>
-      <w:t>2</w:t>
+      <w:t>11</w:t>
     </w:r>
     <w:r>
       <w:rPr/>
@@ -5799,7 +5402,7 @@
     </w:r>
     <w:r>
       <w:rPr/>
-      <w:t>2</w:t>
+      <w:t>11</w:t>
     </w:r>
     <w:r>
       <w:rPr/>
@@ -6404,8 +6007,8 @@
       <w:szCs w:val="36"/>
     </w:rPr>
   </w:style>
-  <w:style w:type="character" w:styleId="Bullets">
-    <w:name w:val="Bullets"/>
+  <w:style w:type="character" w:styleId="Bulletsuser">
+    <w:name w:val="Bullets (user)"/>
     <w:qFormat/>
     <w:rPr>
       <w:rFonts w:ascii="OpenSymbol" w:hAnsi="OpenSymbol" w:eastAsia="OpenSymbol" w:cs="OpenSymbol"/>

</xml_diff>